<commit_message>
Added Singleton and Lazy Singleton classes in OOP
</commit_message>
<xml_diff>
--- a/d3_oop_ostad.docx
+++ b/d3_oop_ostad.docx
@@ -942,17 +942,22 @@
           <w:sz w:val="36"/>
           <w:szCs w:val="36"/>
         </w:rPr>
-        <w:t xml:space="preserve"> (Experimental)……………</w:t>
-      </w:r>
-      <w:proofErr w:type="gramStart"/>
-      <w:r>
-        <w:rPr>
-          <w:sz w:val="36"/>
-          <w:szCs w:val="36"/>
-        </w:rPr>
-        <w:t>…..</w:t>
-      </w:r>
-      <w:proofErr w:type="gramEnd"/>
+        <w:t xml:space="preserve"> (Experimental)………………</w:t>
+      </w:r>
+      <w:r>
+        <w:rPr>
+          <w:sz w:val="36"/>
+          <w:szCs w:val="36"/>
+        </w:rPr>
+        <w:t>….3</w:t>
+      </w:r>
+      <w:r>
+        <w:rPr>
+          <w:sz w:val="36"/>
+          <w:szCs w:val="36"/>
+        </w:rPr>
+        <w:t>8</w:t>
+      </w:r>
     </w:p>
     <w:p>
       <w:pPr>
@@ -972,6 +977,27 @@
           <w:sz w:val="36"/>
           <w:szCs w:val="36"/>
         </w:rPr>
+        <w:t>Singleton &amp; Lazy Singleton Classes…………………….39</w:t>
+      </w:r>
+    </w:p>
+    <w:p>
+      <w:pPr>
+        <w:pStyle w:val="ListParagraph"/>
+        <w:numPr>
+          <w:ilvl w:val="0"/>
+          <w:numId w:val="6"/>
+        </w:numPr>
+        <w:ind w:left="0" w:firstLine="0"/>
+        <w:rPr>
+          <w:sz w:val="36"/>
+          <w:szCs w:val="36"/>
+        </w:rPr>
+      </w:pPr>
+      <w:r>
+        <w:rPr>
+          <w:sz w:val="36"/>
+          <w:szCs w:val="36"/>
+        </w:rPr>
         <w:br w:type="page"/>
       </w:r>
     </w:p>
@@ -24884,7 +24910,21 @@
           <w:sz w:val="36"/>
           <w:szCs w:val="36"/>
         </w:rPr>
-        <w:t>A singleton class creates only one object for the entire app.</w:t>
+        <w:t xml:space="preserve">A </w:t>
+      </w:r>
+      <w:r>
+        <w:rPr>
+          <w:sz w:val="36"/>
+          <w:szCs w:val="36"/>
+        </w:rPr>
+        <w:t>S</w:t>
+      </w:r>
+      <w:r>
+        <w:rPr>
+          <w:sz w:val="36"/>
+          <w:szCs w:val="36"/>
+        </w:rPr>
+        <w:t>ingleton class creates only one object for the entire app.</w:t>
       </w:r>
       <w:r>
         <w:rPr>
@@ -25237,6 +25277,40 @@
     </w:p>
     <w:p>
       <w:pPr>
+        <w:jc w:val="both"/>
+        <w:rPr>
+          <w:sz w:val="36"/>
+          <w:szCs w:val="36"/>
+        </w:rPr>
+      </w:pPr>
+      <w:r>
+        <w:rPr>
+          <w:b/>
+          <w:bCs/>
+          <w:sz w:val="36"/>
+          <w:szCs w:val="36"/>
+        </w:rPr>
+        <w:t xml:space="preserve">NOTE: </w:t>
+      </w:r>
+      <w:r>
+        <w:rPr>
+          <w:sz w:val="36"/>
+          <w:szCs w:val="36"/>
+        </w:rPr>
+        <w:t>See below for more details.</w:t>
+      </w:r>
+    </w:p>
+    <w:p>
+      <w:pPr>
+        <w:jc w:val="both"/>
+        <w:rPr>
+          <w:sz w:val="36"/>
+          <w:szCs w:val="36"/>
+        </w:rPr>
+      </w:pPr>
+    </w:p>
+    <w:p>
+      <w:pPr>
         <w:pStyle w:val="ListParagraph"/>
         <w:numPr>
           <w:ilvl w:val="0"/>
@@ -25444,6 +25518,7 @@
           <w:sz w:val="36"/>
           <w:szCs w:val="36"/>
         </w:rPr>
+        <w:lastRenderedPageBreak/>
         <w:t>Enum Class:</w:t>
       </w:r>
     </w:p>
@@ -25460,18 +25535,653 @@
           <w:sz w:val="36"/>
           <w:szCs w:val="36"/>
         </w:rPr>
+        <w:t># An</w:t>
+      </w:r>
+      <w:r>
+        <w:rPr>
+          <w:b/>
+          <w:bCs/>
+          <w:sz w:val="36"/>
+          <w:szCs w:val="36"/>
+        </w:rPr>
+        <w:t xml:space="preserve"> </w:t>
+      </w:r>
+      <w:proofErr w:type="spellStart"/>
+      <w:r>
+        <w:rPr>
+          <w:b/>
+          <w:bCs/>
+          <w:sz w:val="36"/>
+          <w:szCs w:val="36"/>
+        </w:rPr>
+        <w:t>enum</w:t>
+      </w:r>
+      <w:proofErr w:type="spellEnd"/>
+      <w:r>
+        <w:rPr>
+          <w:sz w:val="36"/>
+          <w:szCs w:val="36"/>
+        </w:rPr>
+        <w:t xml:space="preserve"> stores a fixed set of constant values. Use for loading states, API status and theme modes</w:t>
+      </w:r>
+    </w:p>
+    <w:p>
+      <w:pPr>
+        <w:jc w:val="both"/>
+        <w:rPr>
+          <w:b/>
+          <w:bCs/>
+          <w:color w:val="D86DCB" w:themeColor="accent5" w:themeTint="99"/>
+          <w:sz w:val="36"/>
+          <w:szCs w:val="36"/>
+        </w:rPr>
+      </w:pPr>
+      <w:proofErr w:type="spellStart"/>
+      <w:r>
+        <w:rPr>
+          <w:b/>
+          <w:bCs/>
+          <w:color w:val="D86DCB" w:themeColor="accent5" w:themeTint="99"/>
+          <w:sz w:val="36"/>
+          <w:szCs w:val="36"/>
+        </w:rPr>
+        <w:t>enum</w:t>
+      </w:r>
+      <w:proofErr w:type="spellEnd"/>
+      <w:r>
+        <w:rPr>
+          <w:b/>
+          <w:bCs/>
+          <w:color w:val="D86DCB" w:themeColor="accent5" w:themeTint="99"/>
+          <w:sz w:val="36"/>
+          <w:szCs w:val="36"/>
+        </w:rPr>
+        <w:t xml:space="preserve"> Status {</w:t>
+      </w:r>
+    </w:p>
+    <w:p>
+      <w:pPr>
+        <w:jc w:val="both"/>
+        <w:rPr>
+          <w:b/>
+          <w:bCs/>
+          <w:color w:val="D86DCB" w:themeColor="accent5" w:themeTint="99"/>
+          <w:sz w:val="36"/>
+          <w:szCs w:val="36"/>
+        </w:rPr>
+      </w:pPr>
+      <w:r>
+        <w:rPr>
+          <w:b/>
+          <w:bCs/>
+          <w:color w:val="D86DCB" w:themeColor="accent5" w:themeTint="99"/>
+          <w:sz w:val="36"/>
+          <w:szCs w:val="36"/>
+        </w:rPr>
+        <w:t xml:space="preserve">  </w:t>
+      </w:r>
+      <w:proofErr w:type="spellStart"/>
+      <w:r>
+        <w:rPr>
+          <w:b/>
+          <w:bCs/>
+          <w:color w:val="D86DCB" w:themeColor="accent5" w:themeTint="99"/>
+          <w:sz w:val="36"/>
+          <w:szCs w:val="36"/>
+        </w:rPr>
+        <w:t>isLoading</w:t>
+      </w:r>
+      <w:proofErr w:type="spellEnd"/>
+      <w:r>
+        <w:rPr>
+          <w:b/>
+          <w:bCs/>
+          <w:color w:val="D86DCB" w:themeColor="accent5" w:themeTint="99"/>
+          <w:sz w:val="36"/>
+          <w:szCs w:val="36"/>
+        </w:rPr>
+        <w:t>,</w:t>
+      </w:r>
+    </w:p>
+    <w:p>
+      <w:pPr>
+        <w:jc w:val="both"/>
+        <w:rPr>
+          <w:b/>
+          <w:bCs/>
+          <w:color w:val="D86DCB" w:themeColor="accent5" w:themeTint="99"/>
+          <w:sz w:val="36"/>
+          <w:szCs w:val="36"/>
+        </w:rPr>
+      </w:pPr>
+      <w:r>
+        <w:rPr>
+          <w:b/>
+          <w:bCs/>
+          <w:color w:val="D86DCB" w:themeColor="accent5" w:themeTint="99"/>
+          <w:sz w:val="36"/>
+          <w:szCs w:val="36"/>
+        </w:rPr>
+        <w:t xml:space="preserve">  success,</w:t>
+      </w:r>
+    </w:p>
+    <w:p>
+      <w:pPr>
+        <w:jc w:val="both"/>
+        <w:rPr>
+          <w:b/>
+          <w:bCs/>
+          <w:color w:val="D86DCB" w:themeColor="accent5" w:themeTint="99"/>
+          <w:sz w:val="36"/>
+          <w:szCs w:val="36"/>
+        </w:rPr>
+      </w:pPr>
+      <w:r>
+        <w:rPr>
+          <w:b/>
+          <w:bCs/>
+          <w:color w:val="D86DCB" w:themeColor="accent5" w:themeTint="99"/>
+          <w:sz w:val="36"/>
+          <w:szCs w:val="36"/>
+        </w:rPr>
+        <w:t xml:space="preserve">  error</w:t>
+      </w:r>
+    </w:p>
+    <w:p>
+      <w:pPr>
+        <w:jc w:val="both"/>
+        <w:rPr>
+          <w:b/>
+          <w:bCs/>
+          <w:color w:val="D86DCB" w:themeColor="accent5" w:themeTint="99"/>
+          <w:sz w:val="36"/>
+          <w:szCs w:val="36"/>
+        </w:rPr>
+      </w:pPr>
+      <w:r>
+        <w:rPr>
+          <w:b/>
+          <w:bCs/>
+          <w:color w:val="D86DCB" w:themeColor="accent5" w:themeTint="99"/>
+          <w:sz w:val="36"/>
+          <w:szCs w:val="36"/>
+        </w:rPr>
+        <w:t>}</w:t>
+      </w:r>
+    </w:p>
+    <w:p>
+      <w:pPr>
+        <w:jc w:val="both"/>
+        <w:rPr>
+          <w:b/>
+          <w:bCs/>
+          <w:color w:val="D86DCB" w:themeColor="accent5" w:themeTint="99"/>
+          <w:sz w:val="36"/>
+          <w:szCs w:val="36"/>
+        </w:rPr>
+      </w:pPr>
+      <w:r>
+        <w:rPr>
+          <w:b/>
+          <w:bCs/>
+          <w:color w:val="D86DCB" w:themeColor="accent5" w:themeTint="99"/>
+          <w:sz w:val="36"/>
+          <w:szCs w:val="36"/>
+        </w:rPr>
+        <w:t>// Usage</w:t>
+      </w:r>
+    </w:p>
+    <w:p>
+      <w:pPr>
+        <w:jc w:val="both"/>
+        <w:rPr>
+          <w:color w:val="D86DCB" w:themeColor="accent5" w:themeTint="99"/>
+          <w:sz w:val="36"/>
+          <w:szCs w:val="36"/>
+        </w:rPr>
+      </w:pPr>
+      <w:r>
+        <w:rPr>
+          <w:b/>
+          <w:bCs/>
+          <w:color w:val="D86DCB" w:themeColor="accent5" w:themeTint="99"/>
+          <w:sz w:val="36"/>
+          <w:szCs w:val="36"/>
+        </w:rPr>
+        <w:t xml:space="preserve">final Status </w:t>
+      </w:r>
+      <w:proofErr w:type="spellStart"/>
+      <w:r>
+        <w:rPr>
+          <w:b/>
+          <w:bCs/>
+          <w:color w:val="D86DCB" w:themeColor="accent5" w:themeTint="99"/>
+          <w:sz w:val="36"/>
+          <w:szCs w:val="36"/>
+        </w:rPr>
+        <w:t>apiStatus</w:t>
+      </w:r>
+      <w:proofErr w:type="spellEnd"/>
+      <w:r>
+        <w:rPr>
+          <w:b/>
+          <w:bCs/>
+          <w:color w:val="D86DCB" w:themeColor="accent5" w:themeTint="99"/>
+          <w:sz w:val="36"/>
+          <w:szCs w:val="36"/>
+        </w:rPr>
+        <w:t xml:space="preserve"> = </w:t>
+      </w:r>
+      <w:proofErr w:type="spellStart"/>
+      <w:r>
+        <w:rPr>
+          <w:b/>
+          <w:bCs/>
+          <w:color w:val="D86DCB" w:themeColor="accent5" w:themeTint="99"/>
+          <w:sz w:val="36"/>
+          <w:szCs w:val="36"/>
+        </w:rPr>
+        <w:t>Status.isLoading</w:t>
+      </w:r>
+      <w:proofErr w:type="spellEnd"/>
+      <w:r>
+        <w:rPr>
+          <w:b/>
+          <w:bCs/>
+          <w:color w:val="D86DCB" w:themeColor="accent5" w:themeTint="99"/>
+          <w:sz w:val="36"/>
+          <w:szCs w:val="36"/>
+        </w:rPr>
+        <w:t>;</w:t>
+      </w:r>
+    </w:p>
+    <w:p>
+      <w:pPr>
+        <w:jc w:val="both"/>
+        <w:rPr>
+          <w:sz w:val="36"/>
+          <w:szCs w:val="36"/>
+        </w:rPr>
+      </w:pPr>
+    </w:p>
+    <w:p>
+      <w:pPr>
+        <w:jc w:val="center"/>
+        <w:rPr>
+          <w:sz w:val="36"/>
+          <w:szCs w:val="36"/>
+        </w:rPr>
+      </w:pPr>
+      <w:r>
+        <w:rPr>
+          <w:sz w:val="36"/>
+          <w:szCs w:val="36"/>
+        </w:rPr>
+        <w:t>Break</w:t>
+      </w:r>
+    </w:p>
+    <w:p>
+      <w:pPr>
+        <w:jc w:val="both"/>
+        <w:rPr>
+          <w:sz w:val="36"/>
+          <w:szCs w:val="36"/>
+        </w:rPr>
+      </w:pPr>
+    </w:p>
+    <w:p>
+      <w:pPr>
+        <w:jc w:val="both"/>
+        <w:rPr>
+          <w:b/>
+          <w:bCs/>
+          <w:sz w:val="36"/>
+          <w:szCs w:val="36"/>
+        </w:rPr>
+      </w:pPr>
+      <w:r>
+        <w:rPr>
+          <w:b/>
+          <w:bCs/>
+          <w:sz w:val="36"/>
+          <w:szCs w:val="36"/>
+        </w:rPr>
+        <w:t>Primary Constructors (Experimental):</w:t>
+      </w:r>
+    </w:p>
+    <w:p>
+      <w:pPr>
+        <w:jc w:val="both"/>
+        <w:rPr>
+          <w:sz w:val="36"/>
+          <w:szCs w:val="36"/>
+        </w:rPr>
+      </w:pPr>
+      <w:r>
+        <w:rPr>
+          <w:sz w:val="36"/>
+          <w:szCs w:val="36"/>
+        </w:rPr>
+        <w:t># This is a new experimental feature in Dart 3.12+, see d6 dart new features doc</w:t>
+      </w:r>
+    </w:p>
+    <w:p>
+      <w:pPr>
+        <w:jc w:val="both"/>
+        <w:rPr>
+          <w:sz w:val="36"/>
+          <w:szCs w:val="36"/>
+        </w:rPr>
+      </w:pPr>
+    </w:p>
+    <w:p>
+      <w:pPr>
+        <w:jc w:val="center"/>
+        <w:rPr>
+          <w:sz w:val="36"/>
+          <w:szCs w:val="36"/>
+        </w:rPr>
+      </w:pPr>
+      <w:r>
+        <w:rPr>
+          <w:sz w:val="36"/>
+          <w:szCs w:val="36"/>
+        </w:rPr>
+        <w:t>Break</w:t>
+      </w:r>
+    </w:p>
+    <w:p>
+      <w:pPr>
+        <w:jc w:val="both"/>
+        <w:rPr>
+          <w:sz w:val="36"/>
+          <w:szCs w:val="36"/>
+        </w:rPr>
+      </w:pPr>
+    </w:p>
+    <w:p>
+      <w:pPr>
+        <w:jc w:val="both"/>
+        <w:rPr>
+          <w:b/>
+          <w:bCs/>
+          <w:sz w:val="36"/>
+          <w:szCs w:val="36"/>
+        </w:rPr>
+      </w:pPr>
+      <w:r>
+        <w:rPr>
+          <w:b/>
+          <w:bCs/>
+          <w:sz w:val="36"/>
+          <w:szCs w:val="36"/>
+        </w:rPr>
+        <w:t>Singleton &amp; Lazy Singleton Classes:</w:t>
+      </w:r>
+    </w:p>
+    <w:p>
+      <w:pPr>
+        <w:jc w:val="both"/>
+        <w:rPr>
+          <w:sz w:val="36"/>
+          <w:szCs w:val="36"/>
+        </w:rPr>
+      </w:pPr>
+      <w:r>
+        <w:rPr>
+          <w:sz w:val="36"/>
+          <w:szCs w:val="36"/>
+        </w:rPr>
         <w:lastRenderedPageBreak/>
-        <w:t># An</w:t>
-      </w:r>
-      <w:r>
-        <w:rPr>
-          <w:b/>
-          <w:bCs/>
+        <w:t xml:space="preserve"># </w:t>
+      </w:r>
+      <w:r>
+        <w:rPr>
+          <w:sz w:val="36"/>
+          <w:szCs w:val="36"/>
+        </w:rPr>
+        <w:t>A Singleton means</w:t>
+      </w:r>
+      <w:r>
+        <w:rPr>
           <w:sz w:val="36"/>
           <w:szCs w:val="36"/>
         </w:rPr>
         <w:t xml:space="preserve"> </w:t>
       </w:r>
+      <w:r>
+        <w:rPr>
+          <w:sz w:val="36"/>
+          <w:szCs w:val="36"/>
+        </w:rPr>
+        <w:t>“Only ONE instance</w:t>
+      </w:r>
+      <w:r>
+        <w:rPr>
+          <w:sz w:val="36"/>
+          <w:szCs w:val="36"/>
+        </w:rPr>
+        <w:t xml:space="preserve"> or object</w:t>
+      </w:r>
+      <w:r>
+        <w:rPr>
+          <w:sz w:val="36"/>
+          <w:szCs w:val="36"/>
+        </w:rPr>
+        <w:t xml:space="preserve"> of this class exists in the entire app.”</w:t>
+      </w:r>
+    </w:p>
+    <w:p>
+      <w:pPr>
+        <w:jc w:val="both"/>
+        <w:rPr>
+          <w:sz w:val="36"/>
+          <w:szCs w:val="36"/>
+        </w:rPr>
+      </w:pPr>
+      <w:r>
+        <w:rPr>
+          <w:sz w:val="36"/>
+          <w:szCs w:val="36"/>
+        </w:rPr>
+        <w:t xml:space="preserve"># </w:t>
+      </w:r>
+      <w:r>
+        <w:rPr>
+          <w:sz w:val="36"/>
+          <w:szCs w:val="36"/>
+        </w:rPr>
+        <w:t xml:space="preserve">A </w:t>
+      </w:r>
+      <w:r>
+        <w:rPr>
+          <w:sz w:val="36"/>
+          <w:szCs w:val="36"/>
+        </w:rPr>
+        <w:t>S</w:t>
+      </w:r>
+      <w:r>
+        <w:rPr>
+          <w:sz w:val="36"/>
+          <w:szCs w:val="36"/>
+        </w:rPr>
+        <w:t>ingleton class creates only one object for the entire app.</w:t>
+      </w:r>
+      <w:r>
+        <w:rPr>
+          <w:sz w:val="36"/>
+          <w:szCs w:val="36"/>
+        </w:rPr>
+        <w:t xml:space="preserve"> Key points:</w:t>
+      </w:r>
+    </w:p>
+    <w:p>
+      <w:pPr>
+        <w:pStyle w:val="ListParagraph"/>
+        <w:numPr>
+          <w:ilvl w:val="0"/>
+          <w:numId w:val="20"/>
+        </w:numPr>
+        <w:jc w:val="both"/>
+        <w:rPr>
+          <w:sz w:val="36"/>
+          <w:szCs w:val="36"/>
+        </w:rPr>
+      </w:pPr>
+      <w:r>
+        <w:rPr>
+          <w:sz w:val="36"/>
+          <w:szCs w:val="36"/>
+        </w:rPr>
+        <w:t>Saves memory</w:t>
+      </w:r>
+    </w:p>
+    <w:p>
+      <w:pPr>
+        <w:pStyle w:val="ListParagraph"/>
+        <w:numPr>
+          <w:ilvl w:val="0"/>
+          <w:numId w:val="20"/>
+        </w:numPr>
+        <w:jc w:val="both"/>
+        <w:rPr>
+          <w:sz w:val="36"/>
+          <w:szCs w:val="36"/>
+        </w:rPr>
+      </w:pPr>
+      <w:r>
+        <w:rPr>
+          <w:sz w:val="36"/>
+          <w:szCs w:val="36"/>
+        </w:rPr>
+        <w:t>Shared globally</w:t>
+      </w:r>
+    </w:p>
+    <w:p>
+      <w:pPr>
+        <w:pStyle w:val="ListParagraph"/>
+        <w:numPr>
+          <w:ilvl w:val="0"/>
+          <w:numId w:val="20"/>
+        </w:numPr>
+        <w:jc w:val="both"/>
+        <w:rPr>
+          <w:sz w:val="36"/>
+          <w:szCs w:val="36"/>
+        </w:rPr>
+      </w:pPr>
+      <w:r>
+        <w:rPr>
+          <w:sz w:val="36"/>
+          <w:szCs w:val="36"/>
+        </w:rPr>
+        <w:t>Common in services like</w:t>
+      </w:r>
+      <w:r>
+        <w:rPr>
+          <w:sz w:val="36"/>
+          <w:szCs w:val="36"/>
+        </w:rPr>
+        <w:t>:</w:t>
+      </w:r>
+    </w:p>
+    <w:p>
+      <w:pPr>
+        <w:pStyle w:val="ListParagraph"/>
+        <w:numPr>
+          <w:ilvl w:val="1"/>
+          <w:numId w:val="20"/>
+        </w:numPr>
+        <w:jc w:val="both"/>
+        <w:rPr>
+          <w:sz w:val="36"/>
+          <w:szCs w:val="36"/>
+        </w:rPr>
+      </w:pPr>
+      <w:r>
+        <w:rPr>
+          <w:sz w:val="36"/>
+          <w:szCs w:val="36"/>
+        </w:rPr>
+        <w:t>Dio service</w:t>
+      </w:r>
+      <w:r>
+        <w:rPr>
+          <w:sz w:val="36"/>
+          <w:szCs w:val="36"/>
+        </w:rPr>
+        <w:t xml:space="preserve">, </w:t>
+      </w:r>
+      <w:r>
+        <w:rPr>
+          <w:sz w:val="36"/>
+          <w:szCs w:val="36"/>
+        </w:rPr>
+        <w:t>API service</w:t>
+      </w:r>
+    </w:p>
+    <w:p>
+      <w:pPr>
+        <w:pStyle w:val="ListParagraph"/>
+        <w:numPr>
+          <w:ilvl w:val="1"/>
+          <w:numId w:val="20"/>
+        </w:numPr>
+        <w:jc w:val="both"/>
+        <w:rPr>
+          <w:sz w:val="36"/>
+          <w:szCs w:val="36"/>
+        </w:rPr>
+      </w:pPr>
+      <w:r>
+        <w:rPr>
+          <w:sz w:val="36"/>
+          <w:szCs w:val="36"/>
+        </w:rPr>
+        <w:t>Database servic</w:t>
+      </w:r>
+      <w:r>
+        <w:rPr>
+          <w:sz w:val="36"/>
+          <w:szCs w:val="36"/>
+        </w:rPr>
+        <w:t>e</w:t>
+      </w:r>
+      <w:r>
+        <w:rPr>
+          <w:sz w:val="36"/>
+          <w:szCs w:val="36"/>
+        </w:rPr>
+        <w:t xml:space="preserve">, </w:t>
+      </w:r>
+      <w:r>
+        <w:rPr>
+          <w:sz w:val="36"/>
+          <w:szCs w:val="36"/>
+        </w:rPr>
+        <w:t>Repository cache</w:t>
+      </w:r>
+    </w:p>
+    <w:p>
+      <w:pPr>
+        <w:pStyle w:val="ListParagraph"/>
+        <w:numPr>
+          <w:ilvl w:val="1"/>
+          <w:numId w:val="20"/>
+        </w:numPr>
+        <w:jc w:val="both"/>
+        <w:rPr>
+          <w:sz w:val="36"/>
+          <w:szCs w:val="36"/>
+        </w:rPr>
+      </w:pPr>
+      <w:r>
+        <w:rPr>
+          <w:sz w:val="36"/>
+          <w:szCs w:val="36"/>
+        </w:rPr>
+        <w:t>Analytics service (</w:t>
+      </w:r>
       <w:proofErr w:type="spellStart"/>
       <w:r>
         <w:rPr>
@@ -25480,7 +26190,7 @@
           <w:sz w:val="36"/>
           <w:szCs w:val="36"/>
         </w:rPr>
-        <w:t>enum</w:t>
+        <w:t>FirebaseAnalytics</w:t>
       </w:r>
       <w:proofErr w:type="spellEnd"/>
       <w:r>
@@ -25488,41 +26198,616 @@
           <w:sz w:val="36"/>
           <w:szCs w:val="36"/>
         </w:rPr>
-        <w:t xml:space="preserve"> stores a fixed set of constant values. Use for loading states, API status and theme modes</w:t>
-      </w:r>
-    </w:p>
-    <w:p>
-      <w:pPr>
-        <w:jc w:val="both"/>
-        <w:rPr>
-          <w:b/>
-          <w:bCs/>
-          <w:color w:val="D86DCB" w:themeColor="accent5" w:themeTint="99"/>
-          <w:sz w:val="36"/>
-          <w:szCs w:val="36"/>
-        </w:rPr>
-      </w:pPr>
+        <w:t>)</w:t>
+      </w:r>
+    </w:p>
+    <w:p>
+      <w:pPr>
+        <w:pStyle w:val="ListParagraph"/>
+        <w:numPr>
+          <w:ilvl w:val="1"/>
+          <w:numId w:val="20"/>
+        </w:numPr>
+        <w:jc w:val="both"/>
+        <w:rPr>
+          <w:sz w:val="36"/>
+          <w:szCs w:val="36"/>
+        </w:rPr>
+      </w:pPr>
+      <w:r>
+        <w:rPr>
+          <w:sz w:val="36"/>
+          <w:szCs w:val="36"/>
+        </w:rPr>
+        <w:t>App config</w:t>
+      </w:r>
+      <w:r>
+        <w:rPr>
+          <w:sz w:val="36"/>
+          <w:szCs w:val="36"/>
+        </w:rPr>
+        <w:t xml:space="preserve"> (Environment manager)</w:t>
+      </w:r>
+    </w:p>
+    <w:p>
+      <w:pPr>
+        <w:jc w:val="both"/>
+        <w:rPr>
+          <w:sz w:val="36"/>
+          <w:szCs w:val="36"/>
+        </w:rPr>
+      </w:pPr>
+      <w:r>
+        <w:rPr>
+          <w:sz w:val="36"/>
+          <w:szCs w:val="36"/>
+        </w:rPr>
+        <w:t># Mental model:</w:t>
+      </w:r>
+    </w:p>
+    <w:p>
+      <w:pPr>
+        <w:jc w:val="both"/>
+        <w:rPr>
+          <w:b/>
+          <w:bCs/>
+          <w:sz w:val="36"/>
+          <w:szCs w:val="36"/>
+        </w:rPr>
+      </w:pPr>
+      <w:r>
+        <w:rPr>
+          <w:b/>
+          <w:bCs/>
+          <w:sz w:val="36"/>
+          <w:szCs w:val="36"/>
+        </w:rPr>
+        <w:t>App Memory</w:t>
+      </w:r>
+    </w:p>
+    <w:p>
+      <w:pPr>
+        <w:jc w:val="both"/>
+        <w:rPr>
+          <w:b/>
+          <w:bCs/>
+          <w:sz w:val="36"/>
+          <w:szCs w:val="36"/>
+        </w:rPr>
+      </w:pPr>
+      <w:r>
+        <w:rPr>
+          <w:b/>
+          <w:bCs/>
+          <w:sz w:val="36"/>
+          <w:szCs w:val="36"/>
+        </w:rPr>
+        <w:t xml:space="preserve">   ↓</w:t>
+      </w:r>
+    </w:p>
+    <w:p>
+      <w:pPr>
+        <w:jc w:val="both"/>
+        <w:rPr>
+          <w:b/>
+          <w:bCs/>
+          <w:sz w:val="36"/>
+          <w:szCs w:val="36"/>
+        </w:rPr>
+      </w:pPr>
+      <w:r>
+        <w:rPr>
+          <w:b/>
+          <w:bCs/>
+          <w:sz w:val="36"/>
+          <w:szCs w:val="36"/>
+        </w:rPr>
+        <w:t xml:space="preserve">One </w:t>
+      </w:r>
       <w:proofErr w:type="spellStart"/>
       <w:r>
         <w:rPr>
           <w:b/>
           <w:bCs/>
-          <w:color w:val="D86DCB" w:themeColor="accent5" w:themeTint="99"/>
-          <w:sz w:val="36"/>
-          <w:szCs w:val="36"/>
-        </w:rPr>
-        <w:t>enum</w:t>
+          <w:sz w:val="36"/>
+          <w:szCs w:val="36"/>
+        </w:rPr>
+        <w:t>ApiService</w:t>
       </w:r>
       <w:proofErr w:type="spellEnd"/>
       <w:r>
         <w:rPr>
           <w:b/>
           <w:bCs/>
-          <w:color w:val="D86DCB" w:themeColor="accent5" w:themeTint="99"/>
-          <w:sz w:val="36"/>
-          <w:szCs w:val="36"/>
-        </w:rPr>
-        <w:t xml:space="preserve"> Status {</w:t>
+          <w:sz w:val="36"/>
+          <w:szCs w:val="36"/>
+        </w:rPr>
+        <w:t xml:space="preserve"> object</w:t>
+      </w:r>
+    </w:p>
+    <w:p>
+      <w:pPr>
+        <w:jc w:val="both"/>
+        <w:rPr>
+          <w:b/>
+          <w:bCs/>
+          <w:sz w:val="36"/>
+          <w:szCs w:val="36"/>
+        </w:rPr>
+      </w:pPr>
+      <w:r>
+        <w:rPr>
+          <w:b/>
+          <w:bCs/>
+          <w:sz w:val="36"/>
+          <w:szCs w:val="36"/>
+        </w:rPr>
+        <w:t xml:space="preserve">   ↓</w:t>
+      </w:r>
+    </w:p>
+    <w:p>
+      <w:pPr>
+        <w:jc w:val="both"/>
+        <w:rPr>
+          <w:b/>
+          <w:bCs/>
+          <w:sz w:val="36"/>
+          <w:szCs w:val="36"/>
+        </w:rPr>
+      </w:pPr>
+      <w:r>
+        <w:rPr>
+          <w:b/>
+          <w:bCs/>
+          <w:sz w:val="36"/>
+          <w:szCs w:val="36"/>
+        </w:rPr>
+        <w:t>Everybody uses same reference</w:t>
+      </w:r>
+    </w:p>
+    <w:p>
+      <w:pPr>
+        <w:jc w:val="both"/>
+        <w:rPr>
+          <w:sz w:val="36"/>
+          <w:szCs w:val="36"/>
+        </w:rPr>
+      </w:pPr>
+      <w:r>
+        <w:rPr>
+          <w:sz w:val="36"/>
+          <w:szCs w:val="36"/>
+        </w:rPr>
+        <w:t xml:space="preserve"># It can be created using two patterns like </w:t>
+      </w:r>
+      <w:r>
+        <w:rPr>
+          <w:b/>
+          <w:bCs/>
+          <w:sz w:val="36"/>
+          <w:szCs w:val="36"/>
+        </w:rPr>
+        <w:t>factory</w:t>
+      </w:r>
+      <w:r>
+        <w:rPr>
+          <w:sz w:val="36"/>
+          <w:szCs w:val="36"/>
+        </w:rPr>
+        <w:t xml:space="preserve"> constructor</w:t>
+      </w:r>
+    </w:p>
+    <w:p>
+      <w:pPr>
+        <w:jc w:val="both"/>
+        <w:rPr>
+          <w:b/>
+          <w:bCs/>
+          <w:color w:val="D86DCB" w:themeColor="accent5" w:themeTint="99"/>
+          <w:sz w:val="36"/>
+          <w:szCs w:val="36"/>
+        </w:rPr>
+      </w:pPr>
+      <w:r>
+        <w:rPr>
+          <w:b/>
+          <w:bCs/>
+          <w:color w:val="D86DCB" w:themeColor="accent5" w:themeTint="99"/>
+          <w:sz w:val="36"/>
+          <w:szCs w:val="36"/>
+        </w:rPr>
+        <w:t xml:space="preserve">class </w:t>
+      </w:r>
+      <w:proofErr w:type="spellStart"/>
+      <w:r>
+        <w:rPr>
+          <w:b/>
+          <w:bCs/>
+          <w:color w:val="D86DCB" w:themeColor="accent5" w:themeTint="99"/>
+          <w:sz w:val="36"/>
+          <w:szCs w:val="36"/>
+        </w:rPr>
+        <w:t>ApiService</w:t>
+      </w:r>
+      <w:proofErr w:type="spellEnd"/>
+      <w:r>
+        <w:rPr>
+          <w:b/>
+          <w:bCs/>
+          <w:color w:val="D86DCB" w:themeColor="accent5" w:themeTint="99"/>
+          <w:sz w:val="36"/>
+          <w:szCs w:val="36"/>
+        </w:rPr>
+        <w:t xml:space="preserve"> {</w:t>
+      </w:r>
+    </w:p>
+    <w:p>
+      <w:pPr>
+        <w:jc w:val="both"/>
+        <w:rPr>
+          <w:b/>
+          <w:bCs/>
+          <w:color w:val="D86DCB" w:themeColor="accent5" w:themeTint="99"/>
+          <w:sz w:val="36"/>
+          <w:szCs w:val="36"/>
+        </w:rPr>
+      </w:pPr>
+      <w:r>
+        <w:rPr>
+          <w:b/>
+          <w:bCs/>
+          <w:color w:val="D86DCB" w:themeColor="accent5" w:themeTint="99"/>
+          <w:sz w:val="36"/>
+          <w:szCs w:val="36"/>
+        </w:rPr>
+        <w:t xml:space="preserve">   </w:t>
+      </w:r>
+      <w:proofErr w:type="spellStart"/>
+      <w:proofErr w:type="gramStart"/>
+      <w:r>
+        <w:rPr>
+          <w:b/>
+          <w:bCs/>
+          <w:color w:val="D86DCB" w:themeColor="accent5" w:themeTint="99"/>
+          <w:sz w:val="36"/>
+          <w:szCs w:val="36"/>
+        </w:rPr>
+        <w:t>ApiService</w:t>
+      </w:r>
+      <w:proofErr w:type="spellEnd"/>
+      <w:r>
+        <w:rPr>
+          <w:b/>
+          <w:bCs/>
+          <w:color w:val="D86DCB" w:themeColor="accent5" w:themeTint="99"/>
+          <w:sz w:val="36"/>
+          <w:szCs w:val="36"/>
+        </w:rPr>
+        <w:t>._</w:t>
+      </w:r>
+      <w:proofErr w:type="gramEnd"/>
+      <w:r>
+        <w:rPr>
+          <w:b/>
+          <w:bCs/>
+          <w:color w:val="D86DCB" w:themeColor="accent5" w:themeTint="99"/>
+          <w:sz w:val="36"/>
+          <w:szCs w:val="36"/>
+        </w:rPr>
+        <w:t>internal();</w:t>
+      </w:r>
+    </w:p>
+    <w:p>
+      <w:pPr>
+        <w:jc w:val="both"/>
+        <w:rPr>
+          <w:b/>
+          <w:bCs/>
+          <w:color w:val="D86DCB" w:themeColor="accent5" w:themeTint="99"/>
+          <w:sz w:val="36"/>
+          <w:szCs w:val="36"/>
+        </w:rPr>
+      </w:pPr>
+      <w:r>
+        <w:rPr>
+          <w:b/>
+          <w:bCs/>
+          <w:color w:val="D86DCB" w:themeColor="accent5" w:themeTint="99"/>
+          <w:sz w:val="36"/>
+          <w:szCs w:val="36"/>
+        </w:rPr>
+        <w:t xml:space="preserve">  static final </w:t>
+      </w:r>
+      <w:proofErr w:type="spellStart"/>
+      <w:r>
+        <w:rPr>
+          <w:b/>
+          <w:bCs/>
+          <w:color w:val="D86DCB" w:themeColor="accent5" w:themeTint="99"/>
+          <w:sz w:val="36"/>
+          <w:szCs w:val="36"/>
+        </w:rPr>
+        <w:t>ApiService</w:t>
+      </w:r>
+      <w:proofErr w:type="spellEnd"/>
+      <w:r>
+        <w:rPr>
+          <w:b/>
+          <w:bCs/>
+          <w:color w:val="D86DCB" w:themeColor="accent5" w:themeTint="99"/>
+          <w:sz w:val="36"/>
+          <w:szCs w:val="36"/>
+        </w:rPr>
+        <w:t xml:space="preserve"> _instance = </w:t>
+      </w:r>
+      <w:proofErr w:type="spellStart"/>
+      <w:proofErr w:type="gramStart"/>
+      <w:r>
+        <w:rPr>
+          <w:b/>
+          <w:bCs/>
+          <w:color w:val="D86DCB" w:themeColor="accent5" w:themeTint="99"/>
+          <w:sz w:val="36"/>
+          <w:szCs w:val="36"/>
+        </w:rPr>
+        <w:t>ApiService</w:t>
+      </w:r>
+      <w:proofErr w:type="spellEnd"/>
+      <w:r>
+        <w:rPr>
+          <w:b/>
+          <w:bCs/>
+          <w:color w:val="D86DCB" w:themeColor="accent5" w:themeTint="99"/>
+          <w:sz w:val="36"/>
+          <w:szCs w:val="36"/>
+        </w:rPr>
+        <w:t>._</w:t>
+      </w:r>
+      <w:proofErr w:type="gramEnd"/>
+      <w:r>
+        <w:rPr>
+          <w:b/>
+          <w:bCs/>
+          <w:color w:val="D86DCB" w:themeColor="accent5" w:themeTint="99"/>
+          <w:sz w:val="36"/>
+          <w:szCs w:val="36"/>
+        </w:rPr>
+        <w:t>internal();</w:t>
+      </w:r>
+    </w:p>
+    <w:p>
+      <w:pPr>
+        <w:jc w:val="both"/>
+        <w:rPr>
+          <w:b/>
+          <w:bCs/>
+          <w:color w:val="D86DCB" w:themeColor="accent5" w:themeTint="99"/>
+          <w:sz w:val="36"/>
+          <w:szCs w:val="36"/>
+        </w:rPr>
+      </w:pPr>
+      <w:r>
+        <w:rPr>
+          <w:b/>
+          <w:bCs/>
+          <w:color w:val="D86DCB" w:themeColor="accent5" w:themeTint="99"/>
+          <w:sz w:val="36"/>
+          <w:szCs w:val="36"/>
+        </w:rPr>
+        <w:lastRenderedPageBreak/>
+        <w:t xml:space="preserve">  factory </w:t>
+      </w:r>
+      <w:proofErr w:type="spellStart"/>
+      <w:proofErr w:type="gramStart"/>
+      <w:r>
+        <w:rPr>
+          <w:b/>
+          <w:bCs/>
+          <w:color w:val="D86DCB" w:themeColor="accent5" w:themeTint="99"/>
+          <w:sz w:val="36"/>
+          <w:szCs w:val="36"/>
+        </w:rPr>
+        <w:t>ApiService</w:t>
+      </w:r>
+      <w:proofErr w:type="spellEnd"/>
+      <w:r>
+        <w:rPr>
+          <w:b/>
+          <w:bCs/>
+          <w:color w:val="D86DCB" w:themeColor="accent5" w:themeTint="99"/>
+          <w:sz w:val="36"/>
+          <w:szCs w:val="36"/>
+        </w:rPr>
+        <w:t>(</w:t>
+      </w:r>
+      <w:proofErr w:type="gramEnd"/>
+      <w:r>
+        <w:rPr>
+          <w:b/>
+          <w:bCs/>
+          <w:color w:val="D86DCB" w:themeColor="accent5" w:themeTint="99"/>
+          <w:sz w:val="36"/>
+          <w:szCs w:val="36"/>
+        </w:rPr>
+        <w:t>) {</w:t>
+      </w:r>
+    </w:p>
+    <w:p>
+      <w:pPr>
+        <w:jc w:val="both"/>
+        <w:rPr>
+          <w:b/>
+          <w:bCs/>
+          <w:color w:val="D86DCB" w:themeColor="accent5" w:themeTint="99"/>
+          <w:sz w:val="36"/>
+          <w:szCs w:val="36"/>
+        </w:rPr>
+      </w:pPr>
+      <w:r>
+        <w:rPr>
+          <w:b/>
+          <w:bCs/>
+          <w:color w:val="D86DCB" w:themeColor="accent5" w:themeTint="99"/>
+          <w:sz w:val="36"/>
+          <w:szCs w:val="36"/>
+        </w:rPr>
+        <w:t xml:space="preserve">    return _instance;</w:t>
+      </w:r>
+    </w:p>
+    <w:p>
+      <w:pPr>
+        <w:jc w:val="both"/>
+        <w:rPr>
+          <w:b/>
+          <w:bCs/>
+          <w:color w:val="D86DCB" w:themeColor="accent5" w:themeTint="99"/>
+          <w:sz w:val="36"/>
+          <w:szCs w:val="36"/>
+        </w:rPr>
+      </w:pPr>
+      <w:r>
+        <w:rPr>
+          <w:b/>
+          <w:bCs/>
+          <w:color w:val="D86DCB" w:themeColor="accent5" w:themeTint="99"/>
+          <w:sz w:val="36"/>
+          <w:szCs w:val="36"/>
+        </w:rPr>
+        <w:t xml:space="preserve">  }</w:t>
+      </w:r>
+    </w:p>
+    <w:p>
+      <w:pPr>
+        <w:jc w:val="both"/>
+        <w:rPr>
+          <w:sz w:val="36"/>
+          <w:szCs w:val="36"/>
+        </w:rPr>
+      </w:pPr>
+      <w:r>
+        <w:rPr>
+          <w:sz w:val="36"/>
+          <w:szCs w:val="36"/>
+        </w:rPr>
+        <w:t xml:space="preserve"># Or </w:t>
+      </w:r>
+      <w:r>
+        <w:rPr>
+          <w:b/>
+          <w:bCs/>
+          <w:sz w:val="36"/>
+          <w:szCs w:val="36"/>
+        </w:rPr>
+        <w:t>_</w:t>
+      </w:r>
+      <w:proofErr w:type="spellStart"/>
+      <w:proofErr w:type="gramStart"/>
+      <w:r>
+        <w:rPr>
+          <w:b/>
+          <w:bCs/>
+          <w:sz w:val="36"/>
+          <w:szCs w:val="36"/>
+        </w:rPr>
+        <w:t>privateConstructor</w:t>
+      </w:r>
+      <w:proofErr w:type="spellEnd"/>
+      <w:r>
+        <w:rPr>
+          <w:b/>
+          <w:bCs/>
+          <w:sz w:val="36"/>
+          <w:szCs w:val="36"/>
+        </w:rPr>
+        <w:t>(</w:t>
+      </w:r>
+      <w:proofErr w:type="gramEnd"/>
+      <w:r>
+        <w:rPr>
+          <w:b/>
+          <w:bCs/>
+          <w:sz w:val="36"/>
+          <w:szCs w:val="36"/>
+        </w:rPr>
+        <w:t>)</w:t>
+      </w:r>
+      <w:r>
+        <w:rPr>
+          <w:sz w:val="36"/>
+          <w:szCs w:val="36"/>
+        </w:rPr>
+        <w:t xml:space="preserve"> this prevents class calling  for instance creation (</w:t>
+      </w:r>
+      <w:proofErr w:type="spellStart"/>
+      <w:r>
+        <w:rPr>
+          <w:b/>
+          <w:bCs/>
+          <w:sz w:val="36"/>
+          <w:szCs w:val="36"/>
+        </w:rPr>
+        <w:t>ApiService</w:t>
+      </w:r>
+      <w:proofErr w:type="spellEnd"/>
+      <w:r>
+        <w:rPr>
+          <w:b/>
+          <w:bCs/>
+          <w:sz w:val="36"/>
+          <w:szCs w:val="36"/>
+        </w:rPr>
+        <w:t>()</w:t>
+      </w:r>
+      <w:r>
+        <w:rPr>
+          <w:sz w:val="36"/>
+          <w:szCs w:val="36"/>
+        </w:rPr>
+        <w:t xml:space="preserve"> not allowed) so nobody can create new instances externally</w:t>
+      </w:r>
+    </w:p>
+    <w:p>
+      <w:pPr>
+        <w:jc w:val="both"/>
+        <w:rPr>
+          <w:b/>
+          <w:bCs/>
+          <w:color w:val="D86DCB" w:themeColor="accent5" w:themeTint="99"/>
+          <w:sz w:val="36"/>
+          <w:szCs w:val="36"/>
+        </w:rPr>
+      </w:pPr>
+      <w:r>
+        <w:rPr>
+          <w:b/>
+          <w:bCs/>
+          <w:color w:val="D86DCB" w:themeColor="accent5" w:themeTint="99"/>
+          <w:sz w:val="36"/>
+          <w:szCs w:val="36"/>
+        </w:rPr>
+        <w:t xml:space="preserve">class </w:t>
+      </w:r>
+      <w:proofErr w:type="spellStart"/>
+      <w:r>
+        <w:rPr>
+          <w:b/>
+          <w:bCs/>
+          <w:color w:val="D86DCB" w:themeColor="accent5" w:themeTint="99"/>
+          <w:sz w:val="36"/>
+          <w:szCs w:val="36"/>
+        </w:rPr>
+        <w:t>ApiService</w:t>
+      </w:r>
+      <w:proofErr w:type="spellEnd"/>
+      <w:r>
+        <w:rPr>
+          <w:b/>
+          <w:bCs/>
+          <w:color w:val="D86DCB" w:themeColor="accent5" w:themeTint="99"/>
+          <w:sz w:val="36"/>
+          <w:szCs w:val="36"/>
+        </w:rPr>
+        <w:t xml:space="preserve"> {</w:t>
       </w:r>
     </w:p>
     <w:p>
@@ -25547,15 +26832,16 @@
         <w:t xml:space="preserve">  </w:t>
       </w:r>
       <w:proofErr w:type="spellStart"/>
-      <w:r>
-        <w:rPr>
-          <w:b/>
-          <w:bCs/>
-          <w:color w:val="D86DCB" w:themeColor="accent5" w:themeTint="99"/>
-          <w:sz w:val="36"/>
-          <w:szCs w:val="36"/>
-        </w:rPr>
-        <w:t>isLoading</w:t>
+      <w:proofErr w:type="gramStart"/>
+      <w:r>
+        <w:rPr>
+          <w:b/>
+          <w:bCs/>
+          <w:color w:val="D86DCB" w:themeColor="accent5" w:themeTint="99"/>
+          <w:sz w:val="36"/>
+          <w:szCs w:val="36"/>
+        </w:rPr>
+        <w:t>ApiService</w:t>
       </w:r>
       <w:proofErr w:type="spellEnd"/>
       <w:r>
@@ -25566,51 +26852,264 @@
           <w:sz w:val="36"/>
           <w:szCs w:val="36"/>
         </w:rPr>
-        <w:t>,</w:t>
-      </w:r>
-    </w:p>
-    <w:p>
-      <w:pPr>
-        <w:jc w:val="both"/>
-        <w:rPr>
-          <w:b/>
-          <w:bCs/>
-          <w:color w:val="D86DCB" w:themeColor="accent5" w:themeTint="99"/>
-          <w:sz w:val="36"/>
-          <w:szCs w:val="36"/>
-        </w:rPr>
-      </w:pPr>
-      <w:r>
-        <w:rPr>
-          <w:b/>
-          <w:bCs/>
-          <w:color w:val="D86DCB" w:themeColor="accent5" w:themeTint="99"/>
-          <w:sz w:val="36"/>
-          <w:szCs w:val="36"/>
-        </w:rPr>
-        <w:t xml:space="preserve">  success,</w:t>
-      </w:r>
-    </w:p>
-    <w:p>
-      <w:pPr>
-        <w:jc w:val="both"/>
-        <w:rPr>
-          <w:b/>
-          <w:bCs/>
-          <w:color w:val="D86DCB" w:themeColor="accent5" w:themeTint="99"/>
-          <w:sz w:val="36"/>
-          <w:szCs w:val="36"/>
-        </w:rPr>
-      </w:pPr>
-      <w:r>
-        <w:rPr>
-          <w:b/>
-          <w:bCs/>
-          <w:color w:val="D86DCB" w:themeColor="accent5" w:themeTint="99"/>
-          <w:sz w:val="36"/>
-          <w:szCs w:val="36"/>
-        </w:rPr>
-        <w:t xml:space="preserve">  error</w:t>
+        <w:t>._</w:t>
+      </w:r>
+      <w:proofErr w:type="spellStart"/>
+      <w:proofErr w:type="gramEnd"/>
+      <w:r>
+        <w:rPr>
+          <w:b/>
+          <w:bCs/>
+          <w:color w:val="D86DCB" w:themeColor="accent5" w:themeTint="99"/>
+          <w:sz w:val="36"/>
+          <w:szCs w:val="36"/>
+        </w:rPr>
+        <w:t>privateConstructor</w:t>
+      </w:r>
+      <w:proofErr w:type="spellEnd"/>
+      <w:r>
+        <w:rPr>
+          <w:b/>
+          <w:bCs/>
+          <w:color w:val="D86DCB" w:themeColor="accent5" w:themeTint="99"/>
+          <w:sz w:val="36"/>
+          <w:szCs w:val="36"/>
+        </w:rPr>
+        <w:t>();</w:t>
+      </w:r>
+    </w:p>
+    <w:p>
+      <w:pPr>
+        <w:jc w:val="both"/>
+        <w:rPr>
+          <w:b/>
+          <w:bCs/>
+          <w:color w:val="D86DCB" w:themeColor="accent5" w:themeTint="99"/>
+          <w:sz w:val="36"/>
+          <w:szCs w:val="36"/>
+        </w:rPr>
+      </w:pPr>
+      <w:r>
+        <w:rPr>
+          <w:b/>
+          <w:bCs/>
+          <w:color w:val="D86DCB" w:themeColor="accent5" w:themeTint="99"/>
+          <w:sz w:val="36"/>
+          <w:szCs w:val="36"/>
+        </w:rPr>
+        <w:t xml:space="preserve">  static final </w:t>
+      </w:r>
+      <w:proofErr w:type="spellStart"/>
+      <w:r>
+        <w:rPr>
+          <w:b/>
+          <w:bCs/>
+          <w:color w:val="D86DCB" w:themeColor="accent5" w:themeTint="99"/>
+          <w:sz w:val="36"/>
+          <w:szCs w:val="36"/>
+        </w:rPr>
+        <w:t>ApiService</w:t>
+      </w:r>
+      <w:proofErr w:type="spellEnd"/>
+      <w:r>
+        <w:rPr>
+          <w:b/>
+          <w:bCs/>
+          <w:color w:val="D86DCB" w:themeColor="accent5" w:themeTint="99"/>
+          <w:sz w:val="36"/>
+          <w:szCs w:val="36"/>
+        </w:rPr>
+        <w:t xml:space="preserve"> instance =</w:t>
+      </w:r>
+    </w:p>
+    <w:p>
+      <w:pPr>
+        <w:jc w:val="both"/>
+        <w:rPr>
+          <w:b/>
+          <w:bCs/>
+          <w:color w:val="D86DCB" w:themeColor="accent5" w:themeTint="99"/>
+          <w:sz w:val="36"/>
+          <w:szCs w:val="36"/>
+        </w:rPr>
+      </w:pPr>
+      <w:r>
+        <w:rPr>
+          <w:b/>
+          <w:bCs/>
+          <w:color w:val="D86DCB" w:themeColor="accent5" w:themeTint="99"/>
+          <w:sz w:val="36"/>
+          <w:szCs w:val="36"/>
+        </w:rPr>
+        <w:t xml:space="preserve">      </w:t>
+      </w:r>
+      <w:proofErr w:type="spellStart"/>
+      <w:proofErr w:type="gramStart"/>
+      <w:r>
+        <w:rPr>
+          <w:b/>
+          <w:bCs/>
+          <w:color w:val="D86DCB" w:themeColor="accent5" w:themeTint="99"/>
+          <w:sz w:val="36"/>
+          <w:szCs w:val="36"/>
+        </w:rPr>
+        <w:t>ApiService</w:t>
+      </w:r>
+      <w:proofErr w:type="spellEnd"/>
+      <w:r>
+        <w:rPr>
+          <w:b/>
+          <w:bCs/>
+          <w:color w:val="D86DCB" w:themeColor="accent5" w:themeTint="99"/>
+          <w:sz w:val="36"/>
+          <w:szCs w:val="36"/>
+        </w:rPr>
+        <w:t>._</w:t>
+      </w:r>
+      <w:proofErr w:type="spellStart"/>
+      <w:proofErr w:type="gramEnd"/>
+      <w:r>
+        <w:rPr>
+          <w:b/>
+          <w:bCs/>
+          <w:color w:val="D86DCB" w:themeColor="accent5" w:themeTint="99"/>
+          <w:sz w:val="36"/>
+          <w:szCs w:val="36"/>
+        </w:rPr>
+        <w:t>privateConstructor</w:t>
+      </w:r>
+      <w:proofErr w:type="spellEnd"/>
+      <w:r>
+        <w:rPr>
+          <w:b/>
+          <w:bCs/>
+          <w:color w:val="D86DCB" w:themeColor="accent5" w:themeTint="99"/>
+          <w:sz w:val="36"/>
+          <w:szCs w:val="36"/>
+        </w:rPr>
+        <w:t>();</w:t>
+      </w:r>
+    </w:p>
+    <w:p>
+      <w:pPr>
+        <w:jc w:val="both"/>
+        <w:rPr>
+          <w:b/>
+          <w:bCs/>
+          <w:color w:val="D86DCB" w:themeColor="accent5" w:themeTint="99"/>
+          <w:sz w:val="36"/>
+          <w:szCs w:val="36"/>
+        </w:rPr>
+      </w:pPr>
+      <w:r>
+        <w:rPr>
+          <w:b/>
+          <w:bCs/>
+          <w:color w:val="D86DCB" w:themeColor="accent5" w:themeTint="99"/>
+          <w:sz w:val="36"/>
+          <w:szCs w:val="36"/>
+        </w:rPr>
+        <w:t xml:space="preserve">  void </w:t>
+      </w:r>
+      <w:proofErr w:type="spellStart"/>
+      <w:proofErr w:type="gramStart"/>
+      <w:r>
+        <w:rPr>
+          <w:b/>
+          <w:bCs/>
+          <w:color w:val="D86DCB" w:themeColor="accent5" w:themeTint="99"/>
+          <w:sz w:val="36"/>
+          <w:szCs w:val="36"/>
+        </w:rPr>
+        <w:t>fetchData</w:t>
+      </w:r>
+      <w:proofErr w:type="spellEnd"/>
+      <w:r>
+        <w:rPr>
+          <w:b/>
+          <w:bCs/>
+          <w:color w:val="D86DCB" w:themeColor="accent5" w:themeTint="99"/>
+          <w:sz w:val="36"/>
+          <w:szCs w:val="36"/>
+        </w:rPr>
+        <w:t>(</w:t>
+      </w:r>
+      <w:proofErr w:type="gramEnd"/>
+      <w:r>
+        <w:rPr>
+          <w:b/>
+          <w:bCs/>
+          <w:color w:val="D86DCB" w:themeColor="accent5" w:themeTint="99"/>
+          <w:sz w:val="36"/>
+          <w:szCs w:val="36"/>
+        </w:rPr>
+        <w:t>) {</w:t>
+      </w:r>
+    </w:p>
+    <w:p>
+      <w:pPr>
+        <w:jc w:val="both"/>
+        <w:rPr>
+          <w:b/>
+          <w:bCs/>
+          <w:color w:val="D86DCB" w:themeColor="accent5" w:themeTint="99"/>
+          <w:sz w:val="36"/>
+          <w:szCs w:val="36"/>
+        </w:rPr>
+      </w:pPr>
+      <w:r>
+        <w:rPr>
+          <w:b/>
+          <w:bCs/>
+          <w:color w:val="D86DCB" w:themeColor="accent5" w:themeTint="99"/>
+          <w:sz w:val="36"/>
+          <w:szCs w:val="36"/>
+        </w:rPr>
+        <w:t xml:space="preserve">    </w:t>
+      </w:r>
+      <w:proofErr w:type="gramStart"/>
+      <w:r>
+        <w:rPr>
+          <w:b/>
+          <w:bCs/>
+          <w:color w:val="D86DCB" w:themeColor="accent5" w:themeTint="99"/>
+          <w:sz w:val="36"/>
+          <w:szCs w:val="36"/>
+        </w:rPr>
+        <w:t>print(</w:t>
+      </w:r>
+      <w:proofErr w:type="gramEnd"/>
+      <w:r>
+        <w:rPr>
+          <w:b/>
+          <w:bCs/>
+          <w:color w:val="D86DCB" w:themeColor="accent5" w:themeTint="99"/>
+          <w:sz w:val="36"/>
+          <w:szCs w:val="36"/>
+        </w:rPr>
+        <w:t>"Fetching...");</w:t>
+      </w:r>
+    </w:p>
+    <w:p>
+      <w:pPr>
+        <w:jc w:val="both"/>
+        <w:rPr>
+          <w:b/>
+          <w:bCs/>
+          <w:color w:val="D86DCB" w:themeColor="accent5" w:themeTint="99"/>
+          <w:sz w:val="36"/>
+          <w:szCs w:val="36"/>
+        </w:rPr>
+      </w:pPr>
+      <w:r>
+        <w:rPr>
+          <w:b/>
+          <w:bCs/>
+          <w:color w:val="D86DCB" w:themeColor="accent5" w:themeTint="99"/>
+          <w:sz w:val="36"/>
+          <w:szCs w:val="36"/>
+        </w:rPr>
+        <w:t xml:space="preserve">  }</w:t>
       </w:r>
     </w:p>
     <w:p>
@@ -25639,42 +27138,207 @@
       <w:pPr>
         <w:jc w:val="both"/>
         <w:rPr>
-          <w:b/>
-          <w:bCs/>
-          <w:color w:val="D86DCB" w:themeColor="accent5" w:themeTint="99"/>
-          <w:sz w:val="36"/>
-          <w:szCs w:val="36"/>
-        </w:rPr>
-      </w:pPr>
-      <w:r>
-        <w:rPr>
-          <w:b/>
-          <w:bCs/>
-          <w:color w:val="D86DCB" w:themeColor="accent5" w:themeTint="99"/>
-          <w:sz w:val="36"/>
-          <w:szCs w:val="36"/>
-        </w:rPr>
-        <w:t>// Usage</w:t>
-      </w:r>
-    </w:p>
-    <w:p>
-      <w:pPr>
-        <w:jc w:val="both"/>
-        <w:rPr>
-          <w:color w:val="D86DCB" w:themeColor="accent5" w:themeTint="99"/>
-          <w:sz w:val="36"/>
-          <w:szCs w:val="36"/>
-        </w:rPr>
-      </w:pPr>
-      <w:r>
-        <w:rPr>
-          <w:b/>
-          <w:bCs/>
-          <w:color w:val="D86DCB" w:themeColor="accent5" w:themeTint="99"/>
-          <w:sz w:val="36"/>
-          <w:szCs w:val="36"/>
-        </w:rPr>
-        <w:t xml:space="preserve">final Status </w:t>
+          <w:sz w:val="36"/>
+          <w:szCs w:val="36"/>
+        </w:rPr>
+      </w:pPr>
+      <w:r>
+        <w:rPr>
+          <w:sz w:val="36"/>
+          <w:szCs w:val="36"/>
+        </w:rPr>
+        <w:t># Lastly, Singleton is not a global variable or global state everywhere, it is a controlled shared instance and centralized lifecycle</w:t>
+      </w:r>
+    </w:p>
+    <w:p>
+      <w:pPr>
+        <w:jc w:val="both"/>
+        <w:rPr>
+          <w:sz w:val="36"/>
+          <w:szCs w:val="36"/>
+        </w:rPr>
+      </w:pPr>
+    </w:p>
+    <w:p>
+      <w:pPr>
+        <w:jc w:val="both"/>
+        <w:rPr>
+          <w:sz w:val="36"/>
+          <w:szCs w:val="36"/>
+        </w:rPr>
+      </w:pPr>
+      <w:r>
+        <w:rPr>
+          <w:sz w:val="36"/>
+          <w:szCs w:val="36"/>
+        </w:rPr>
+        <w:t>Lazy Singleton Class:</w:t>
+      </w:r>
+    </w:p>
+    <w:p>
+      <w:pPr>
+        <w:jc w:val="both"/>
+        <w:rPr>
+          <w:sz w:val="36"/>
+          <w:szCs w:val="36"/>
+        </w:rPr>
+      </w:pPr>
+      <w:r>
+        <w:rPr>
+          <w:sz w:val="36"/>
+          <w:szCs w:val="36"/>
+        </w:rPr>
+        <w:t># Singleton c</w:t>
+      </w:r>
+      <w:r>
+        <w:rPr>
+          <w:sz w:val="36"/>
+          <w:szCs w:val="36"/>
+        </w:rPr>
+        <w:t xml:space="preserve">lass </w:t>
+      </w:r>
+      <w:r>
+        <w:rPr>
+          <w:sz w:val="36"/>
+          <w:szCs w:val="36"/>
+        </w:rPr>
+        <w:t xml:space="preserve">instance </w:t>
+      </w:r>
+      <w:r>
+        <w:rPr>
+          <w:sz w:val="36"/>
+          <w:szCs w:val="36"/>
+        </w:rPr>
+        <w:t>is one shared object created</w:t>
+      </w:r>
+      <w:r>
+        <w:rPr>
+          <w:sz w:val="36"/>
+          <w:szCs w:val="36"/>
+        </w:rPr>
+        <w:t xml:space="preserve"> immediately when class is first loaded</w:t>
+      </w:r>
+    </w:p>
+    <w:p>
+      <w:pPr>
+        <w:jc w:val="both"/>
+        <w:rPr>
+          <w:sz w:val="36"/>
+          <w:szCs w:val="36"/>
+        </w:rPr>
+      </w:pPr>
+      <w:r>
+        <w:rPr>
+          <w:sz w:val="36"/>
+          <w:szCs w:val="36"/>
+        </w:rPr>
+        <w:lastRenderedPageBreak/>
+        <w:t># While Lazy Singleton class</w:t>
+      </w:r>
+      <w:r>
+        <w:rPr>
+          <w:sz w:val="36"/>
+          <w:szCs w:val="36"/>
+        </w:rPr>
+        <w:t xml:space="preserve"> instance is one shared object created only when needed</w:t>
+      </w:r>
+    </w:p>
+    <w:p>
+      <w:pPr>
+        <w:jc w:val="both"/>
+        <w:rPr>
+          <w:sz w:val="36"/>
+          <w:szCs w:val="36"/>
+        </w:rPr>
+      </w:pPr>
+      <w:r>
+        <w:rPr>
+          <w:sz w:val="36"/>
+          <w:szCs w:val="36"/>
+        </w:rPr>
+        <w:t># This lazy creation saves memory and improves performance</w:t>
+      </w:r>
+    </w:p>
+    <w:p>
+      <w:pPr>
+        <w:jc w:val="both"/>
+        <w:rPr>
+          <w:sz w:val="36"/>
+          <w:szCs w:val="36"/>
+        </w:rPr>
+      </w:pPr>
+      <w:r>
+        <w:rPr>
+          <w:sz w:val="36"/>
+          <w:szCs w:val="36"/>
+        </w:rPr>
+        <w:t># null aware assignment (</w:t>
+      </w:r>
+      <w:r>
+        <w:rPr>
+          <w:b/>
+          <w:bCs/>
+          <w:sz w:val="36"/>
+          <w:szCs w:val="36"/>
+        </w:rPr>
+        <w:t>??=</w:t>
+      </w:r>
+      <w:r>
+        <w:rPr>
+          <w:sz w:val="36"/>
+          <w:szCs w:val="36"/>
+        </w:rPr>
+        <w:t xml:space="preserve">) ensures if null </w:t>
+      </w:r>
+      <w:r>
+        <w:rPr>
+          <w:sz w:val="36"/>
+          <w:szCs w:val="36"/>
+        </w:rPr>
+        <w:sym w:font="Wingdings" w:char="F0E0"/>
+      </w:r>
+      <w:r>
+        <w:rPr>
+          <w:sz w:val="36"/>
+          <w:szCs w:val="36"/>
+        </w:rPr>
+        <w:t xml:space="preserve"> create instance else </w:t>
+      </w:r>
+      <w:r>
+        <w:rPr>
+          <w:sz w:val="36"/>
+          <w:szCs w:val="36"/>
+        </w:rPr>
+        <w:sym w:font="Wingdings" w:char="F0E0"/>
+      </w:r>
+      <w:r>
+        <w:rPr>
+          <w:sz w:val="36"/>
+          <w:szCs w:val="36"/>
+        </w:rPr>
+        <w:t xml:space="preserve"> reuse existing instance or object</w:t>
+      </w:r>
+    </w:p>
+    <w:p>
+      <w:pPr>
+        <w:jc w:val="both"/>
+        <w:rPr>
+          <w:b/>
+          <w:bCs/>
+          <w:color w:val="D86DCB" w:themeColor="accent5" w:themeTint="99"/>
+          <w:sz w:val="36"/>
+          <w:szCs w:val="36"/>
+        </w:rPr>
+      </w:pPr>
+      <w:r>
+        <w:rPr>
+          <w:b/>
+          <w:bCs/>
+          <w:color w:val="D86DCB" w:themeColor="accent5" w:themeTint="99"/>
+          <w:sz w:val="36"/>
+          <w:szCs w:val="36"/>
+        </w:rPr>
+        <w:t xml:space="preserve">class </w:t>
       </w:r>
       <w:proofErr w:type="spellStart"/>
       <w:r>
@@ -25685,7 +27349,7 @@
           <w:sz w:val="36"/>
           <w:szCs w:val="36"/>
         </w:rPr>
-        <w:t>apiStatus</w:t>
+        <w:t>DatabaseService</w:t>
       </w:r>
       <w:proofErr w:type="spellEnd"/>
       <w:r>
@@ -25696,18 +27360,41 @@
           <w:sz w:val="36"/>
           <w:szCs w:val="36"/>
         </w:rPr>
-        <w:t xml:space="preserve"> = </w:t>
+        <w:t xml:space="preserve"> {</w:t>
+      </w:r>
+    </w:p>
+    <w:p>
+      <w:pPr>
+        <w:jc w:val="both"/>
+        <w:rPr>
+          <w:b/>
+          <w:bCs/>
+          <w:color w:val="D86DCB" w:themeColor="accent5" w:themeTint="99"/>
+          <w:sz w:val="36"/>
+          <w:szCs w:val="36"/>
+        </w:rPr>
+      </w:pPr>
+      <w:r>
+        <w:rPr>
+          <w:b/>
+          <w:bCs/>
+          <w:color w:val="D86DCB" w:themeColor="accent5" w:themeTint="99"/>
+          <w:sz w:val="36"/>
+          <w:szCs w:val="36"/>
+        </w:rPr>
+        <w:t xml:space="preserve">  </w:t>
       </w:r>
       <w:proofErr w:type="spellStart"/>
-      <w:r>
-        <w:rPr>
-          <w:b/>
-          <w:bCs/>
-          <w:color w:val="D86DCB" w:themeColor="accent5" w:themeTint="99"/>
-          <w:sz w:val="36"/>
-          <w:szCs w:val="36"/>
-        </w:rPr>
-        <w:t>Status.isLoading</w:t>
+      <w:proofErr w:type="gramStart"/>
+      <w:r>
+        <w:rPr>
+          <w:b/>
+          <w:bCs/>
+          <w:color w:val="D86DCB" w:themeColor="accent5" w:themeTint="99"/>
+          <w:sz w:val="36"/>
+          <w:szCs w:val="36"/>
+        </w:rPr>
+        <w:t>DatabaseService</w:t>
       </w:r>
       <w:proofErr w:type="spellEnd"/>
       <w:r>
@@ -25718,7 +27405,702 @@
           <w:sz w:val="36"/>
           <w:szCs w:val="36"/>
         </w:rPr>
-        <w:t>;</w:t>
+        <w:t>._</w:t>
+      </w:r>
+      <w:proofErr w:type="gramEnd"/>
+      <w:r>
+        <w:rPr>
+          <w:b/>
+          <w:bCs/>
+          <w:color w:val="D86DCB" w:themeColor="accent5" w:themeTint="99"/>
+          <w:sz w:val="36"/>
+          <w:szCs w:val="36"/>
+        </w:rPr>
+        <w:t>();</w:t>
+      </w:r>
+    </w:p>
+    <w:p>
+      <w:pPr>
+        <w:jc w:val="both"/>
+        <w:rPr>
+          <w:b/>
+          <w:bCs/>
+          <w:color w:val="D86DCB" w:themeColor="accent5" w:themeTint="99"/>
+          <w:sz w:val="36"/>
+          <w:szCs w:val="36"/>
+        </w:rPr>
+      </w:pPr>
+    </w:p>
+    <w:p>
+      <w:pPr>
+        <w:jc w:val="both"/>
+        <w:rPr>
+          <w:b/>
+          <w:bCs/>
+          <w:color w:val="D86DCB" w:themeColor="accent5" w:themeTint="99"/>
+          <w:sz w:val="36"/>
+          <w:szCs w:val="36"/>
+        </w:rPr>
+      </w:pPr>
+      <w:r>
+        <w:rPr>
+          <w:b/>
+          <w:bCs/>
+          <w:color w:val="D86DCB" w:themeColor="accent5" w:themeTint="99"/>
+          <w:sz w:val="36"/>
+          <w:szCs w:val="36"/>
+        </w:rPr>
+        <w:t xml:space="preserve">  static </w:t>
+      </w:r>
+      <w:proofErr w:type="spellStart"/>
+      <w:r>
+        <w:rPr>
+          <w:b/>
+          <w:bCs/>
+          <w:color w:val="D86DCB" w:themeColor="accent5" w:themeTint="99"/>
+          <w:sz w:val="36"/>
+          <w:szCs w:val="36"/>
+        </w:rPr>
+        <w:t>DatabaseService</w:t>
+      </w:r>
+      <w:proofErr w:type="spellEnd"/>
+      <w:r>
+        <w:rPr>
+          <w:b/>
+          <w:bCs/>
+          <w:color w:val="D86DCB" w:themeColor="accent5" w:themeTint="99"/>
+          <w:sz w:val="36"/>
+          <w:szCs w:val="36"/>
+        </w:rPr>
+        <w:t>? _instance;</w:t>
+      </w:r>
+    </w:p>
+    <w:p>
+      <w:pPr>
+        <w:jc w:val="both"/>
+        <w:rPr>
+          <w:b/>
+          <w:bCs/>
+          <w:color w:val="D86DCB" w:themeColor="accent5" w:themeTint="99"/>
+          <w:sz w:val="36"/>
+          <w:szCs w:val="36"/>
+        </w:rPr>
+      </w:pPr>
+    </w:p>
+    <w:p>
+      <w:pPr>
+        <w:jc w:val="both"/>
+        <w:rPr>
+          <w:b/>
+          <w:bCs/>
+          <w:color w:val="D86DCB" w:themeColor="accent5" w:themeTint="99"/>
+          <w:sz w:val="36"/>
+          <w:szCs w:val="36"/>
+        </w:rPr>
+      </w:pPr>
+      <w:r>
+        <w:rPr>
+          <w:b/>
+          <w:bCs/>
+          <w:color w:val="D86DCB" w:themeColor="accent5" w:themeTint="99"/>
+          <w:sz w:val="36"/>
+          <w:szCs w:val="36"/>
+        </w:rPr>
+        <w:t xml:space="preserve">  static </w:t>
+      </w:r>
+      <w:proofErr w:type="spellStart"/>
+      <w:r>
+        <w:rPr>
+          <w:b/>
+          <w:bCs/>
+          <w:color w:val="D86DCB" w:themeColor="accent5" w:themeTint="99"/>
+          <w:sz w:val="36"/>
+          <w:szCs w:val="36"/>
+        </w:rPr>
+        <w:t>DatabaseService</w:t>
+      </w:r>
+      <w:proofErr w:type="spellEnd"/>
+      <w:r>
+        <w:rPr>
+          <w:b/>
+          <w:bCs/>
+          <w:color w:val="D86DCB" w:themeColor="accent5" w:themeTint="99"/>
+          <w:sz w:val="36"/>
+          <w:szCs w:val="36"/>
+        </w:rPr>
+        <w:t xml:space="preserve"> get instance {</w:t>
+      </w:r>
+    </w:p>
+    <w:p>
+      <w:pPr>
+        <w:jc w:val="both"/>
+        <w:rPr>
+          <w:b/>
+          <w:bCs/>
+          <w:color w:val="D86DCB" w:themeColor="accent5" w:themeTint="99"/>
+          <w:sz w:val="36"/>
+          <w:szCs w:val="36"/>
+        </w:rPr>
+      </w:pPr>
+      <w:r>
+        <w:rPr>
+          <w:b/>
+          <w:bCs/>
+          <w:color w:val="D86DCB" w:themeColor="accent5" w:themeTint="99"/>
+          <w:sz w:val="36"/>
+          <w:szCs w:val="36"/>
+        </w:rPr>
+        <w:t xml:space="preserve">    _instance ??= </w:t>
+      </w:r>
+      <w:proofErr w:type="spellStart"/>
+      <w:proofErr w:type="gramStart"/>
+      <w:r>
+        <w:rPr>
+          <w:b/>
+          <w:bCs/>
+          <w:color w:val="D86DCB" w:themeColor="accent5" w:themeTint="99"/>
+          <w:sz w:val="36"/>
+          <w:szCs w:val="36"/>
+        </w:rPr>
+        <w:t>DatabaseService</w:t>
+      </w:r>
+      <w:proofErr w:type="spellEnd"/>
+      <w:r>
+        <w:rPr>
+          <w:b/>
+          <w:bCs/>
+          <w:color w:val="D86DCB" w:themeColor="accent5" w:themeTint="99"/>
+          <w:sz w:val="36"/>
+          <w:szCs w:val="36"/>
+        </w:rPr>
+        <w:t>._</w:t>
+      </w:r>
+      <w:proofErr w:type="gramEnd"/>
+      <w:r>
+        <w:rPr>
+          <w:b/>
+          <w:bCs/>
+          <w:color w:val="D86DCB" w:themeColor="accent5" w:themeTint="99"/>
+          <w:sz w:val="36"/>
+          <w:szCs w:val="36"/>
+        </w:rPr>
+        <w:t>();</w:t>
+      </w:r>
+    </w:p>
+    <w:p>
+      <w:pPr>
+        <w:jc w:val="both"/>
+        <w:rPr>
+          <w:b/>
+          <w:bCs/>
+          <w:color w:val="D86DCB" w:themeColor="accent5" w:themeTint="99"/>
+          <w:sz w:val="36"/>
+          <w:szCs w:val="36"/>
+        </w:rPr>
+      </w:pPr>
+      <w:r>
+        <w:rPr>
+          <w:b/>
+          <w:bCs/>
+          <w:color w:val="D86DCB" w:themeColor="accent5" w:themeTint="99"/>
+          <w:sz w:val="36"/>
+          <w:szCs w:val="36"/>
+        </w:rPr>
+        <w:t xml:space="preserve">    return _</w:t>
+      </w:r>
+      <w:proofErr w:type="gramStart"/>
+      <w:r>
+        <w:rPr>
+          <w:b/>
+          <w:bCs/>
+          <w:color w:val="D86DCB" w:themeColor="accent5" w:themeTint="99"/>
+          <w:sz w:val="36"/>
+          <w:szCs w:val="36"/>
+        </w:rPr>
+        <w:t>instance!;</w:t>
+      </w:r>
+      <w:proofErr w:type="gramEnd"/>
+    </w:p>
+    <w:p>
+      <w:pPr>
+        <w:jc w:val="both"/>
+        <w:rPr>
+          <w:b/>
+          <w:bCs/>
+          <w:color w:val="D86DCB" w:themeColor="accent5" w:themeTint="99"/>
+          <w:sz w:val="36"/>
+          <w:szCs w:val="36"/>
+        </w:rPr>
+      </w:pPr>
+      <w:r>
+        <w:rPr>
+          <w:b/>
+          <w:bCs/>
+          <w:color w:val="D86DCB" w:themeColor="accent5" w:themeTint="99"/>
+          <w:sz w:val="36"/>
+          <w:szCs w:val="36"/>
+        </w:rPr>
+        <w:t xml:space="preserve">  }</w:t>
+      </w:r>
+    </w:p>
+    <w:p>
+      <w:pPr>
+        <w:jc w:val="both"/>
+        <w:rPr>
+          <w:b/>
+          <w:bCs/>
+          <w:color w:val="D86DCB" w:themeColor="accent5" w:themeTint="99"/>
+          <w:sz w:val="36"/>
+          <w:szCs w:val="36"/>
+        </w:rPr>
+      </w:pPr>
+      <w:r>
+        <w:rPr>
+          <w:b/>
+          <w:bCs/>
+          <w:color w:val="D86DCB" w:themeColor="accent5" w:themeTint="99"/>
+          <w:sz w:val="36"/>
+          <w:szCs w:val="36"/>
+        </w:rPr>
+        <w:t>}</w:t>
+      </w:r>
+    </w:p>
+    <w:p>
+      <w:pPr>
+        <w:jc w:val="both"/>
+        <w:rPr>
+          <w:sz w:val="36"/>
+          <w:szCs w:val="36"/>
+        </w:rPr>
+      </w:pPr>
+    </w:p>
+    <w:p>
+      <w:pPr>
+        <w:jc w:val="both"/>
+        <w:rPr>
+          <w:sz w:val="36"/>
+          <w:szCs w:val="36"/>
+        </w:rPr>
+      </w:pPr>
+      <w:r>
+        <w:rPr>
+          <w:sz w:val="36"/>
+          <w:szCs w:val="36"/>
+        </w:rPr>
+        <w:t>Important Info:</w:t>
+      </w:r>
+    </w:p>
+    <w:p>
+      <w:pPr>
+        <w:jc w:val="both"/>
+        <w:rPr>
+          <w:sz w:val="36"/>
+          <w:szCs w:val="36"/>
+        </w:rPr>
+      </w:pPr>
+      <w:r>
+        <w:rPr>
+          <w:sz w:val="36"/>
+          <w:szCs w:val="36"/>
+        </w:rPr>
+        <w:t xml:space="preserve"># INFO-1, </w:t>
+      </w:r>
+      <w:r>
+        <w:rPr>
+          <w:sz w:val="36"/>
+          <w:szCs w:val="36"/>
+        </w:rPr>
+        <w:t>In many languages</w:t>
+      </w:r>
+      <w:r>
+        <w:rPr>
+          <w:sz w:val="36"/>
+          <w:szCs w:val="36"/>
+        </w:rPr>
+        <w:t xml:space="preserve"> S</w:t>
+      </w:r>
+      <w:r>
+        <w:rPr>
+          <w:sz w:val="36"/>
+          <w:szCs w:val="36"/>
+        </w:rPr>
+        <w:t>ingleton thread safety is hard</w:t>
+      </w:r>
+      <w:r>
+        <w:rPr>
+          <w:sz w:val="36"/>
+          <w:szCs w:val="36"/>
+        </w:rPr>
+        <w:t xml:space="preserve"> </w:t>
+      </w:r>
+      <w:r>
+        <w:rPr>
+          <w:sz w:val="36"/>
+          <w:szCs w:val="36"/>
+        </w:rPr>
+        <w:t xml:space="preserve">BUT in </w:t>
+      </w:r>
+      <w:r>
+        <w:rPr>
+          <w:b/>
+          <w:bCs/>
+          <w:sz w:val="36"/>
+          <w:szCs w:val="36"/>
+        </w:rPr>
+        <w:t>Dart</w:t>
+      </w:r>
+      <w:r>
+        <w:rPr>
+          <w:b/>
+          <w:bCs/>
+          <w:sz w:val="36"/>
+          <w:szCs w:val="36"/>
+        </w:rPr>
+        <w:t xml:space="preserve"> </w:t>
+      </w:r>
+      <w:r>
+        <w:rPr>
+          <w:sz w:val="36"/>
+          <w:szCs w:val="36"/>
+        </w:rPr>
+        <w:t>single isolate execution simplifies this greatly</w:t>
+      </w:r>
+      <w:r>
+        <w:rPr>
+          <w:sz w:val="36"/>
+          <w:szCs w:val="36"/>
+        </w:rPr>
+        <w:t xml:space="preserve"> and s</w:t>
+      </w:r>
+      <w:r>
+        <w:rPr>
+          <w:sz w:val="36"/>
+          <w:szCs w:val="36"/>
+        </w:rPr>
+        <w:t>till relevant with isolates though.</w:t>
+      </w:r>
+    </w:p>
+    <w:p>
+      <w:pPr>
+        <w:jc w:val="both"/>
+        <w:rPr>
+          <w:sz w:val="36"/>
+          <w:szCs w:val="36"/>
+        </w:rPr>
+      </w:pPr>
+      <w:r>
+        <w:rPr>
+          <w:sz w:val="36"/>
+          <w:szCs w:val="36"/>
+        </w:rPr>
+        <w:lastRenderedPageBreak/>
+        <w:t xml:space="preserve"># INFO-2, </w:t>
+      </w:r>
+      <w:r>
+        <w:rPr>
+          <w:sz w:val="36"/>
+          <w:szCs w:val="36"/>
+        </w:rPr>
+        <w:t>Modern architecture often prefers</w:t>
+      </w:r>
+      <w:r>
+        <w:rPr>
+          <w:sz w:val="36"/>
+          <w:szCs w:val="36"/>
+        </w:rPr>
+        <w:t xml:space="preserve"> </w:t>
+      </w:r>
+      <w:r>
+        <w:rPr>
+          <w:sz w:val="36"/>
+          <w:szCs w:val="36"/>
+        </w:rPr>
+        <w:t>Dependency Injection</w:t>
+      </w:r>
+      <w:r>
+        <w:rPr>
+          <w:sz w:val="36"/>
+          <w:szCs w:val="36"/>
+        </w:rPr>
+        <w:t xml:space="preserve"> (passing as parameter in class constructor) </w:t>
+      </w:r>
+      <w:r>
+        <w:rPr>
+          <w:sz w:val="36"/>
+          <w:szCs w:val="36"/>
+        </w:rPr>
+        <w:t>instead of</w:t>
+      </w:r>
+      <w:r>
+        <w:rPr>
+          <w:sz w:val="36"/>
+          <w:szCs w:val="36"/>
+        </w:rPr>
+        <w:t xml:space="preserve"> </w:t>
+      </w:r>
+      <w:r>
+        <w:rPr>
+          <w:sz w:val="36"/>
+          <w:szCs w:val="36"/>
+        </w:rPr>
+        <w:t xml:space="preserve">Manual </w:t>
+      </w:r>
+      <w:r>
+        <w:rPr>
+          <w:sz w:val="36"/>
+          <w:szCs w:val="36"/>
+        </w:rPr>
+        <w:t>S</w:t>
+      </w:r>
+      <w:r>
+        <w:rPr>
+          <w:sz w:val="36"/>
+          <w:szCs w:val="36"/>
+        </w:rPr>
+        <w:t>ingleton access</w:t>
+      </w:r>
+    </w:p>
+    <w:p>
+      <w:pPr>
+        <w:jc w:val="both"/>
+        <w:rPr>
+          <w:sz w:val="36"/>
+          <w:szCs w:val="36"/>
+        </w:rPr>
+      </w:pPr>
+      <w:r>
+        <w:rPr>
+          <w:sz w:val="36"/>
+          <w:szCs w:val="36"/>
+        </w:rPr>
+        <w:t xml:space="preserve"># INFO-3, </w:t>
+      </w:r>
+      <w:r>
+        <w:rPr>
+          <w:sz w:val="36"/>
+          <w:szCs w:val="36"/>
+        </w:rPr>
+        <w:t xml:space="preserve">Overusing </w:t>
+      </w:r>
+      <w:r>
+        <w:rPr>
+          <w:sz w:val="36"/>
+          <w:szCs w:val="36"/>
+        </w:rPr>
+        <w:t>S</w:t>
+      </w:r>
+      <w:r>
+        <w:rPr>
+          <w:sz w:val="36"/>
+          <w:szCs w:val="36"/>
+        </w:rPr>
+        <w:t>ingletons creates:</w:t>
+      </w:r>
+    </w:p>
+    <w:p>
+      <w:pPr>
+        <w:pStyle w:val="ListParagraph"/>
+        <w:numPr>
+          <w:ilvl w:val="0"/>
+          <w:numId w:val="22"/>
+        </w:numPr>
+        <w:jc w:val="both"/>
+        <w:rPr>
+          <w:sz w:val="36"/>
+          <w:szCs w:val="36"/>
+        </w:rPr>
+      </w:pPr>
+      <w:r>
+        <w:rPr>
+          <w:sz w:val="36"/>
+          <w:szCs w:val="36"/>
+        </w:rPr>
+        <w:t>Hidden dependencies</w:t>
+      </w:r>
+    </w:p>
+    <w:p>
+      <w:pPr>
+        <w:pStyle w:val="ListParagraph"/>
+        <w:numPr>
+          <w:ilvl w:val="0"/>
+          <w:numId w:val="22"/>
+        </w:numPr>
+        <w:jc w:val="both"/>
+        <w:rPr>
+          <w:sz w:val="36"/>
+          <w:szCs w:val="36"/>
+        </w:rPr>
+      </w:pPr>
+      <w:r>
+        <w:rPr>
+          <w:sz w:val="36"/>
+          <w:szCs w:val="36"/>
+        </w:rPr>
+        <w:t>Tight coupling</w:t>
+      </w:r>
+    </w:p>
+    <w:p>
+      <w:pPr>
+        <w:pStyle w:val="ListParagraph"/>
+        <w:numPr>
+          <w:ilvl w:val="0"/>
+          <w:numId w:val="22"/>
+        </w:numPr>
+        <w:jc w:val="both"/>
+        <w:rPr>
+          <w:sz w:val="36"/>
+          <w:szCs w:val="36"/>
+        </w:rPr>
+      </w:pPr>
+      <w:r>
+        <w:rPr>
+          <w:sz w:val="36"/>
+          <w:szCs w:val="36"/>
+        </w:rPr>
+        <w:t>Hard testing</w:t>
+      </w:r>
+    </w:p>
+    <w:p>
+      <w:pPr>
+        <w:pStyle w:val="ListParagraph"/>
+        <w:numPr>
+          <w:ilvl w:val="0"/>
+          <w:numId w:val="22"/>
+        </w:numPr>
+        <w:jc w:val="both"/>
+        <w:rPr>
+          <w:sz w:val="36"/>
+          <w:szCs w:val="36"/>
+        </w:rPr>
+      </w:pPr>
+      <w:r>
+        <w:rPr>
+          <w:sz w:val="36"/>
+          <w:szCs w:val="36"/>
+        </w:rPr>
+        <w:t>Global state mess</w:t>
+      </w:r>
+    </w:p>
+    <w:p>
+      <w:pPr>
+        <w:jc w:val="both"/>
+        <w:rPr>
+          <w:sz w:val="36"/>
+          <w:szCs w:val="36"/>
+        </w:rPr>
+      </w:pPr>
+      <w:r>
+        <w:rPr>
+          <w:sz w:val="36"/>
+          <w:szCs w:val="36"/>
+        </w:rPr>
+        <w:t># INFO-4, instead use</w:t>
+      </w:r>
+      <w:r>
+        <w:rPr>
+          <w:b/>
+          <w:bCs/>
+          <w:sz w:val="36"/>
+          <w:szCs w:val="36"/>
+        </w:rPr>
+        <w:t xml:space="preserve"> </w:t>
+      </w:r>
+      <w:proofErr w:type="spellStart"/>
+      <w:r>
+        <w:rPr>
+          <w:b/>
+          <w:bCs/>
+          <w:sz w:val="36"/>
+          <w:szCs w:val="36"/>
+        </w:rPr>
+        <w:t>get_it</w:t>
+      </w:r>
+      <w:proofErr w:type="spellEnd"/>
+      <w:r>
+        <w:rPr>
+          <w:sz w:val="36"/>
+          <w:szCs w:val="36"/>
+        </w:rPr>
+        <w:t xml:space="preserve"> </w:t>
+      </w:r>
+      <w:proofErr w:type="gramStart"/>
+      <w:r>
+        <w:rPr>
+          <w:sz w:val="36"/>
+          <w:szCs w:val="36"/>
+        </w:rPr>
+        <w:t>package</w:t>
+      </w:r>
+      <w:proofErr w:type="gramEnd"/>
+      <w:r>
+        <w:rPr>
+          <w:sz w:val="36"/>
+          <w:szCs w:val="36"/>
+        </w:rPr>
+        <w:t xml:space="preserve"> or service locator for:</w:t>
+      </w:r>
+    </w:p>
+    <w:p>
+      <w:pPr>
+        <w:pStyle w:val="ListParagraph"/>
+        <w:numPr>
+          <w:ilvl w:val="0"/>
+          <w:numId w:val="21"/>
+        </w:numPr>
+        <w:jc w:val="both"/>
+        <w:rPr>
+          <w:sz w:val="36"/>
+          <w:szCs w:val="36"/>
+        </w:rPr>
+      </w:pPr>
+      <w:r>
+        <w:rPr>
+          <w:sz w:val="36"/>
+          <w:szCs w:val="36"/>
+        </w:rPr>
+        <w:t>easier testing</w:t>
+      </w:r>
+    </w:p>
+    <w:p>
+      <w:pPr>
+        <w:pStyle w:val="ListParagraph"/>
+        <w:numPr>
+          <w:ilvl w:val="0"/>
+          <w:numId w:val="21"/>
+        </w:numPr>
+        <w:jc w:val="both"/>
+        <w:rPr>
+          <w:sz w:val="36"/>
+          <w:szCs w:val="36"/>
+        </w:rPr>
+      </w:pPr>
+      <w:r>
+        <w:rPr>
+          <w:sz w:val="36"/>
+          <w:szCs w:val="36"/>
+        </w:rPr>
+        <w:t>swappable implementations</w:t>
+      </w:r>
+    </w:p>
+    <w:p>
+      <w:pPr>
+        <w:pStyle w:val="ListParagraph"/>
+        <w:numPr>
+          <w:ilvl w:val="0"/>
+          <w:numId w:val="21"/>
+        </w:numPr>
+        <w:jc w:val="both"/>
+        <w:rPr>
+          <w:sz w:val="36"/>
+          <w:szCs w:val="36"/>
+        </w:rPr>
+      </w:pPr>
+      <w:r>
+        <w:rPr>
+          <w:sz w:val="36"/>
+          <w:szCs w:val="36"/>
+        </w:rPr>
+        <w:t>cleaner architecture</w:t>
       </w:r>
     </w:p>
     <w:p>
@@ -25754,42 +28136,6 @@
           <w:szCs w:val="36"/>
         </w:rPr>
       </w:pPr>
-    </w:p>
-    <w:p>
-      <w:pPr>
-        <w:jc w:val="both"/>
-        <w:rPr>
-          <w:b/>
-          <w:bCs/>
-          <w:sz w:val="36"/>
-          <w:szCs w:val="36"/>
-        </w:rPr>
-      </w:pPr>
-      <w:r>
-        <w:rPr>
-          <w:b/>
-          <w:bCs/>
-          <w:sz w:val="36"/>
-          <w:szCs w:val="36"/>
-        </w:rPr>
-        <w:t>Primary Constructors (Experimental):</w:t>
-      </w:r>
-    </w:p>
-    <w:p>
-      <w:pPr>
-        <w:jc w:val="both"/>
-        <w:rPr>
-          <w:sz w:val="36"/>
-          <w:szCs w:val="36"/>
-        </w:rPr>
-      </w:pPr>
-      <w:r>
-        <w:rPr>
-          <w:sz w:val="36"/>
-          <w:szCs w:val="36"/>
-        </w:rPr>
-        <w:t># This is a new experimental feature in Dart 3.12+, see d6 dart new features doc</w:t>
-      </w:r>
     </w:p>
     <w:p>
       <w:pPr>
@@ -26030,9 +28376,9 @@
     </w:lvl>
   </w:abstractNum>
   <w:abstractNum w:abstractNumId="1" w15:restartNumberingAfterBreak="0">
-    <w:nsid w:val="0E614CA7"/>
+    <w:nsid w:val="009A3349"/>
     <w:multiLevelType w:val="hybridMultilevel"/>
-    <w:tmpl w:val="EAF65E5A"/>
+    <w:tmpl w:val="634E260E"/>
     <w:lvl w:ilvl="0" w:tplc="04090001">
       <w:start w:val="1"/>
       <w:numFmt w:val="bullet"/>
@@ -26143,9 +28489,9 @@
     </w:lvl>
   </w:abstractNum>
   <w:abstractNum w:abstractNumId="2" w15:restartNumberingAfterBreak="0">
-    <w:nsid w:val="10B06898"/>
+    <w:nsid w:val="0E614CA7"/>
     <w:multiLevelType w:val="hybridMultilevel"/>
-    <w:tmpl w:val="9A123904"/>
+    <w:tmpl w:val="EAF65E5A"/>
     <w:lvl w:ilvl="0" w:tplc="04090001">
       <w:start w:val="1"/>
       <w:numFmt w:val="bullet"/>
@@ -26256,16 +28602,16 @@
     </w:lvl>
   </w:abstractNum>
   <w:abstractNum w:abstractNumId="3" w15:restartNumberingAfterBreak="0">
-    <w:nsid w:val="1D9F0FE3"/>
+    <w:nsid w:val="10B06898"/>
     <w:multiLevelType w:val="hybridMultilevel"/>
-    <w:tmpl w:val="4DC268E4"/>
+    <w:tmpl w:val="9A123904"/>
     <w:lvl w:ilvl="0" w:tplc="04090001">
       <w:start w:val="1"/>
       <w:numFmt w:val="bullet"/>
       <w:lvlText w:val=""/>
       <w:lvlJc w:val="left"/>
       <w:pPr>
-        <w:ind w:left="-360" w:hanging="360"/>
+        <w:ind w:left="360" w:hanging="360"/>
       </w:pPr>
       <w:rPr>
         <w:rFonts w:ascii="Symbol" w:hAnsi="Symbol" w:hint="default"/>
@@ -26277,7 +28623,7 @@
       <w:lvlText w:val="o"/>
       <w:lvlJc w:val="left"/>
       <w:pPr>
-        <w:ind w:left="360" w:hanging="360"/>
+        <w:ind w:left="1080" w:hanging="360"/>
       </w:pPr>
       <w:rPr>
         <w:rFonts w:ascii="Courier New" w:hAnsi="Courier New" w:cs="Courier New" w:hint="default"/>
@@ -26289,7 +28635,7 @@
       <w:lvlText w:val=""/>
       <w:lvlJc w:val="left"/>
       <w:pPr>
-        <w:ind w:left="1080" w:hanging="360"/>
+        <w:ind w:left="1800" w:hanging="360"/>
       </w:pPr>
       <w:rPr>
         <w:rFonts w:ascii="Wingdings" w:hAnsi="Wingdings" w:hint="default"/>
@@ -26301,7 +28647,7 @@
       <w:lvlText w:val=""/>
       <w:lvlJc w:val="left"/>
       <w:pPr>
-        <w:ind w:left="1800" w:hanging="360"/>
+        <w:ind w:left="2520" w:hanging="360"/>
       </w:pPr>
       <w:rPr>
         <w:rFonts w:ascii="Symbol" w:hAnsi="Symbol" w:hint="default"/>
@@ -26313,7 +28659,7 @@
       <w:lvlText w:val="o"/>
       <w:lvlJc w:val="left"/>
       <w:pPr>
-        <w:ind w:left="2520" w:hanging="360"/>
+        <w:ind w:left="3240" w:hanging="360"/>
       </w:pPr>
       <w:rPr>
         <w:rFonts w:ascii="Courier New" w:hAnsi="Courier New" w:cs="Courier New" w:hint="default"/>
@@ -26325,7 +28671,7 @@
       <w:lvlText w:val=""/>
       <w:lvlJc w:val="left"/>
       <w:pPr>
-        <w:ind w:left="3240" w:hanging="360"/>
+        <w:ind w:left="3960" w:hanging="360"/>
       </w:pPr>
       <w:rPr>
         <w:rFonts w:ascii="Wingdings" w:hAnsi="Wingdings" w:hint="default"/>
@@ -26337,7 +28683,7 @@
       <w:lvlText w:val=""/>
       <w:lvlJc w:val="left"/>
       <w:pPr>
-        <w:ind w:left="3960" w:hanging="360"/>
+        <w:ind w:left="4680" w:hanging="360"/>
       </w:pPr>
       <w:rPr>
         <w:rFonts w:ascii="Symbol" w:hAnsi="Symbol" w:hint="default"/>
@@ -26349,7 +28695,7 @@
       <w:lvlText w:val="o"/>
       <w:lvlJc w:val="left"/>
       <w:pPr>
-        <w:ind w:left="4680" w:hanging="360"/>
+        <w:ind w:left="5400" w:hanging="360"/>
       </w:pPr>
       <w:rPr>
         <w:rFonts w:ascii="Courier New" w:hAnsi="Courier New" w:cs="Courier New" w:hint="default"/>
@@ -26361,7 +28707,7 @@
       <w:lvlText w:val=""/>
       <w:lvlJc w:val="left"/>
       <w:pPr>
-        <w:ind w:left="5400" w:hanging="360"/>
+        <w:ind w:left="6120" w:hanging="360"/>
       </w:pPr>
       <w:rPr>
         <w:rFonts w:ascii="Wingdings" w:hAnsi="Wingdings" w:hint="default"/>
@@ -26369,6 +28715,232 @@
     </w:lvl>
   </w:abstractNum>
   <w:abstractNum w:abstractNumId="4" w15:restartNumberingAfterBreak="0">
+    <w:nsid w:val="1C970102"/>
+    <w:multiLevelType w:val="hybridMultilevel"/>
+    <w:tmpl w:val="C3F4EE88"/>
+    <w:lvl w:ilvl="0" w:tplc="04090001">
+      <w:start w:val="1"/>
+      <w:numFmt w:val="bullet"/>
+      <w:lvlText w:val=""/>
+      <w:lvlJc w:val="left"/>
+      <w:pPr>
+        <w:ind w:left="360" w:hanging="360"/>
+      </w:pPr>
+      <w:rPr>
+        <w:rFonts w:ascii="Symbol" w:hAnsi="Symbol" w:hint="default"/>
+      </w:rPr>
+    </w:lvl>
+    <w:lvl w:ilvl="1" w:tplc="04090003" w:tentative="1">
+      <w:start w:val="1"/>
+      <w:numFmt w:val="bullet"/>
+      <w:lvlText w:val="o"/>
+      <w:lvlJc w:val="left"/>
+      <w:pPr>
+        <w:ind w:left="1080" w:hanging="360"/>
+      </w:pPr>
+      <w:rPr>
+        <w:rFonts w:ascii="Courier New" w:hAnsi="Courier New" w:cs="Courier New" w:hint="default"/>
+      </w:rPr>
+    </w:lvl>
+    <w:lvl w:ilvl="2" w:tplc="04090005" w:tentative="1">
+      <w:start w:val="1"/>
+      <w:numFmt w:val="bullet"/>
+      <w:lvlText w:val=""/>
+      <w:lvlJc w:val="left"/>
+      <w:pPr>
+        <w:ind w:left="1800" w:hanging="360"/>
+      </w:pPr>
+      <w:rPr>
+        <w:rFonts w:ascii="Wingdings" w:hAnsi="Wingdings" w:hint="default"/>
+      </w:rPr>
+    </w:lvl>
+    <w:lvl w:ilvl="3" w:tplc="04090001" w:tentative="1">
+      <w:start w:val="1"/>
+      <w:numFmt w:val="bullet"/>
+      <w:lvlText w:val=""/>
+      <w:lvlJc w:val="left"/>
+      <w:pPr>
+        <w:ind w:left="2520" w:hanging="360"/>
+      </w:pPr>
+      <w:rPr>
+        <w:rFonts w:ascii="Symbol" w:hAnsi="Symbol" w:hint="default"/>
+      </w:rPr>
+    </w:lvl>
+    <w:lvl w:ilvl="4" w:tplc="04090003" w:tentative="1">
+      <w:start w:val="1"/>
+      <w:numFmt w:val="bullet"/>
+      <w:lvlText w:val="o"/>
+      <w:lvlJc w:val="left"/>
+      <w:pPr>
+        <w:ind w:left="3240" w:hanging="360"/>
+      </w:pPr>
+      <w:rPr>
+        <w:rFonts w:ascii="Courier New" w:hAnsi="Courier New" w:cs="Courier New" w:hint="default"/>
+      </w:rPr>
+    </w:lvl>
+    <w:lvl w:ilvl="5" w:tplc="04090005" w:tentative="1">
+      <w:start w:val="1"/>
+      <w:numFmt w:val="bullet"/>
+      <w:lvlText w:val=""/>
+      <w:lvlJc w:val="left"/>
+      <w:pPr>
+        <w:ind w:left="3960" w:hanging="360"/>
+      </w:pPr>
+      <w:rPr>
+        <w:rFonts w:ascii="Wingdings" w:hAnsi="Wingdings" w:hint="default"/>
+      </w:rPr>
+    </w:lvl>
+    <w:lvl w:ilvl="6" w:tplc="04090001" w:tentative="1">
+      <w:start w:val="1"/>
+      <w:numFmt w:val="bullet"/>
+      <w:lvlText w:val=""/>
+      <w:lvlJc w:val="left"/>
+      <w:pPr>
+        <w:ind w:left="4680" w:hanging="360"/>
+      </w:pPr>
+      <w:rPr>
+        <w:rFonts w:ascii="Symbol" w:hAnsi="Symbol" w:hint="default"/>
+      </w:rPr>
+    </w:lvl>
+    <w:lvl w:ilvl="7" w:tplc="04090003" w:tentative="1">
+      <w:start w:val="1"/>
+      <w:numFmt w:val="bullet"/>
+      <w:lvlText w:val="o"/>
+      <w:lvlJc w:val="left"/>
+      <w:pPr>
+        <w:ind w:left="5400" w:hanging="360"/>
+      </w:pPr>
+      <w:rPr>
+        <w:rFonts w:ascii="Courier New" w:hAnsi="Courier New" w:cs="Courier New" w:hint="default"/>
+      </w:rPr>
+    </w:lvl>
+    <w:lvl w:ilvl="8" w:tplc="04090005" w:tentative="1">
+      <w:start w:val="1"/>
+      <w:numFmt w:val="bullet"/>
+      <w:lvlText w:val=""/>
+      <w:lvlJc w:val="left"/>
+      <w:pPr>
+        <w:ind w:left="6120" w:hanging="360"/>
+      </w:pPr>
+      <w:rPr>
+        <w:rFonts w:ascii="Wingdings" w:hAnsi="Wingdings" w:hint="default"/>
+      </w:rPr>
+    </w:lvl>
+  </w:abstractNum>
+  <w:abstractNum w:abstractNumId="5" w15:restartNumberingAfterBreak="0">
+    <w:nsid w:val="1D9F0FE3"/>
+    <w:multiLevelType w:val="hybridMultilevel"/>
+    <w:tmpl w:val="4DC268E4"/>
+    <w:lvl w:ilvl="0" w:tplc="04090001">
+      <w:start w:val="1"/>
+      <w:numFmt w:val="bullet"/>
+      <w:lvlText w:val=""/>
+      <w:lvlJc w:val="left"/>
+      <w:pPr>
+        <w:ind w:left="-360" w:hanging="360"/>
+      </w:pPr>
+      <w:rPr>
+        <w:rFonts w:ascii="Symbol" w:hAnsi="Symbol" w:hint="default"/>
+      </w:rPr>
+    </w:lvl>
+    <w:lvl w:ilvl="1" w:tplc="04090003" w:tentative="1">
+      <w:start w:val="1"/>
+      <w:numFmt w:val="bullet"/>
+      <w:lvlText w:val="o"/>
+      <w:lvlJc w:val="left"/>
+      <w:pPr>
+        <w:ind w:left="360" w:hanging="360"/>
+      </w:pPr>
+      <w:rPr>
+        <w:rFonts w:ascii="Courier New" w:hAnsi="Courier New" w:cs="Courier New" w:hint="default"/>
+      </w:rPr>
+    </w:lvl>
+    <w:lvl w:ilvl="2" w:tplc="04090005" w:tentative="1">
+      <w:start w:val="1"/>
+      <w:numFmt w:val="bullet"/>
+      <w:lvlText w:val=""/>
+      <w:lvlJc w:val="left"/>
+      <w:pPr>
+        <w:ind w:left="1080" w:hanging="360"/>
+      </w:pPr>
+      <w:rPr>
+        <w:rFonts w:ascii="Wingdings" w:hAnsi="Wingdings" w:hint="default"/>
+      </w:rPr>
+    </w:lvl>
+    <w:lvl w:ilvl="3" w:tplc="04090001" w:tentative="1">
+      <w:start w:val="1"/>
+      <w:numFmt w:val="bullet"/>
+      <w:lvlText w:val=""/>
+      <w:lvlJc w:val="left"/>
+      <w:pPr>
+        <w:ind w:left="1800" w:hanging="360"/>
+      </w:pPr>
+      <w:rPr>
+        <w:rFonts w:ascii="Symbol" w:hAnsi="Symbol" w:hint="default"/>
+      </w:rPr>
+    </w:lvl>
+    <w:lvl w:ilvl="4" w:tplc="04090003" w:tentative="1">
+      <w:start w:val="1"/>
+      <w:numFmt w:val="bullet"/>
+      <w:lvlText w:val="o"/>
+      <w:lvlJc w:val="left"/>
+      <w:pPr>
+        <w:ind w:left="2520" w:hanging="360"/>
+      </w:pPr>
+      <w:rPr>
+        <w:rFonts w:ascii="Courier New" w:hAnsi="Courier New" w:cs="Courier New" w:hint="default"/>
+      </w:rPr>
+    </w:lvl>
+    <w:lvl w:ilvl="5" w:tplc="04090005" w:tentative="1">
+      <w:start w:val="1"/>
+      <w:numFmt w:val="bullet"/>
+      <w:lvlText w:val=""/>
+      <w:lvlJc w:val="left"/>
+      <w:pPr>
+        <w:ind w:left="3240" w:hanging="360"/>
+      </w:pPr>
+      <w:rPr>
+        <w:rFonts w:ascii="Wingdings" w:hAnsi="Wingdings" w:hint="default"/>
+      </w:rPr>
+    </w:lvl>
+    <w:lvl w:ilvl="6" w:tplc="04090001" w:tentative="1">
+      <w:start w:val="1"/>
+      <w:numFmt w:val="bullet"/>
+      <w:lvlText w:val=""/>
+      <w:lvlJc w:val="left"/>
+      <w:pPr>
+        <w:ind w:left="3960" w:hanging="360"/>
+      </w:pPr>
+      <w:rPr>
+        <w:rFonts w:ascii="Symbol" w:hAnsi="Symbol" w:hint="default"/>
+      </w:rPr>
+    </w:lvl>
+    <w:lvl w:ilvl="7" w:tplc="04090003" w:tentative="1">
+      <w:start w:val="1"/>
+      <w:numFmt w:val="bullet"/>
+      <w:lvlText w:val="o"/>
+      <w:lvlJc w:val="left"/>
+      <w:pPr>
+        <w:ind w:left="4680" w:hanging="360"/>
+      </w:pPr>
+      <w:rPr>
+        <w:rFonts w:ascii="Courier New" w:hAnsi="Courier New" w:cs="Courier New" w:hint="default"/>
+      </w:rPr>
+    </w:lvl>
+    <w:lvl w:ilvl="8" w:tplc="04090005" w:tentative="1">
+      <w:start w:val="1"/>
+      <w:numFmt w:val="bullet"/>
+      <w:lvlText w:val=""/>
+      <w:lvlJc w:val="left"/>
+      <w:pPr>
+        <w:ind w:left="5400" w:hanging="360"/>
+      </w:pPr>
+      <w:rPr>
+        <w:rFonts w:ascii="Wingdings" w:hAnsi="Wingdings" w:hint="default"/>
+      </w:rPr>
+    </w:lvl>
+  </w:abstractNum>
+  <w:abstractNum w:abstractNumId="6" w15:restartNumberingAfterBreak="0">
     <w:nsid w:val="23B20C03"/>
     <w:multiLevelType w:val="hybridMultilevel"/>
     <w:tmpl w:val="D96698B4"/>
@@ -26459,7 +29031,7 @@
       </w:pPr>
     </w:lvl>
   </w:abstractNum>
-  <w:abstractNum w:abstractNumId="5" w15:restartNumberingAfterBreak="0">
+  <w:abstractNum w:abstractNumId="7" w15:restartNumberingAfterBreak="0">
     <w:nsid w:val="266235E4"/>
     <w:multiLevelType w:val="hybridMultilevel"/>
     <w:tmpl w:val="657A9910"/>
@@ -26572,7 +29144,7 @@
       </w:rPr>
     </w:lvl>
   </w:abstractNum>
-  <w:abstractNum w:abstractNumId="6" w15:restartNumberingAfterBreak="0">
+  <w:abstractNum w:abstractNumId="8" w15:restartNumberingAfterBreak="0">
     <w:nsid w:val="29C23420"/>
     <w:multiLevelType w:val="hybridMultilevel"/>
     <w:tmpl w:val="C87A93E4"/>
@@ -26685,7 +29257,7 @@
       </w:rPr>
     </w:lvl>
   </w:abstractNum>
-  <w:abstractNum w:abstractNumId="7" w15:restartNumberingAfterBreak="0">
+  <w:abstractNum w:abstractNumId="9" w15:restartNumberingAfterBreak="0">
     <w:nsid w:val="36314307"/>
     <w:multiLevelType w:val="hybridMultilevel"/>
     <w:tmpl w:val="28B61EFC"/>
@@ -26798,7 +29370,7 @@
       </w:rPr>
     </w:lvl>
   </w:abstractNum>
-  <w:abstractNum w:abstractNumId="8" w15:restartNumberingAfterBreak="0">
+  <w:abstractNum w:abstractNumId="10" w15:restartNumberingAfterBreak="0">
     <w:nsid w:val="41477539"/>
     <w:multiLevelType w:val="hybridMultilevel"/>
     <w:tmpl w:val="DB142EC0"/>
@@ -26911,7 +29483,7 @@
       </w:rPr>
     </w:lvl>
   </w:abstractNum>
-  <w:abstractNum w:abstractNumId="9" w15:restartNumberingAfterBreak="0">
+  <w:abstractNum w:abstractNumId="11" w15:restartNumberingAfterBreak="0">
     <w:nsid w:val="42D22ADE"/>
     <w:multiLevelType w:val="hybridMultilevel"/>
     <w:tmpl w:val="9D42564E"/>
@@ -27024,7 +29596,7 @@
       </w:rPr>
     </w:lvl>
   </w:abstractNum>
-  <w:abstractNum w:abstractNumId="10" w15:restartNumberingAfterBreak="0">
+  <w:abstractNum w:abstractNumId="12" w15:restartNumberingAfterBreak="0">
     <w:nsid w:val="456C7C17"/>
     <w:multiLevelType w:val="hybridMultilevel"/>
     <w:tmpl w:val="9AF63DF4"/>
@@ -27137,7 +29709,7 @@
       </w:rPr>
     </w:lvl>
   </w:abstractNum>
-  <w:abstractNum w:abstractNumId="11" w15:restartNumberingAfterBreak="0">
+  <w:abstractNum w:abstractNumId="13" w15:restartNumberingAfterBreak="0">
     <w:nsid w:val="4854000A"/>
     <w:multiLevelType w:val="hybridMultilevel"/>
     <w:tmpl w:val="754A2BBA"/>
@@ -27250,7 +29822,7 @@
       </w:rPr>
     </w:lvl>
   </w:abstractNum>
-  <w:abstractNum w:abstractNumId="12" w15:restartNumberingAfterBreak="0">
+  <w:abstractNum w:abstractNumId="14" w15:restartNumberingAfterBreak="0">
     <w:nsid w:val="490A47E2"/>
     <w:multiLevelType w:val="hybridMultilevel"/>
     <w:tmpl w:val="DB0A940C"/>
@@ -27363,10 +29935,10 @@
       </w:rPr>
     </w:lvl>
   </w:abstractNum>
-  <w:abstractNum w:abstractNumId="13" w15:restartNumberingAfterBreak="0">
+  <w:abstractNum w:abstractNumId="15" w15:restartNumberingAfterBreak="0">
     <w:nsid w:val="4D2376F9"/>
     <w:multiLevelType w:val="hybridMultilevel"/>
-    <w:tmpl w:val="2004C148"/>
+    <w:tmpl w:val="8F764D9A"/>
     <w:lvl w:ilvl="0" w:tplc="04090001">
       <w:start w:val="1"/>
       <w:numFmt w:val="bullet"/>
@@ -27379,13 +29951,13 @@
         <w:rFonts w:ascii="Symbol" w:hAnsi="Symbol" w:hint="default"/>
       </w:rPr>
     </w:lvl>
-    <w:lvl w:ilvl="1" w:tplc="04090003" w:tentative="1">
+    <w:lvl w:ilvl="1" w:tplc="04090003">
       <w:start w:val="1"/>
       <w:numFmt w:val="bullet"/>
       <w:lvlText w:val="o"/>
       <w:lvlJc w:val="left"/>
       <w:pPr>
-        <w:ind w:left="1080" w:hanging="360"/>
+        <w:ind w:left="720" w:hanging="360"/>
       </w:pPr>
       <w:rPr>
         <w:rFonts w:ascii="Courier New" w:hAnsi="Courier New" w:cs="Courier New" w:hint="default"/>
@@ -27476,7 +30048,7 @@
       </w:rPr>
     </w:lvl>
   </w:abstractNum>
-  <w:abstractNum w:abstractNumId="14" w15:restartNumberingAfterBreak="0">
+  <w:abstractNum w:abstractNumId="16" w15:restartNumberingAfterBreak="0">
     <w:nsid w:val="5087239D"/>
     <w:multiLevelType w:val="hybridMultilevel"/>
     <w:tmpl w:val="6BEE249C"/>
@@ -27567,7 +30139,7 @@
       </w:pPr>
     </w:lvl>
   </w:abstractNum>
-  <w:abstractNum w:abstractNumId="15" w15:restartNumberingAfterBreak="0">
+  <w:abstractNum w:abstractNumId="17" w15:restartNumberingAfterBreak="0">
     <w:nsid w:val="682235BC"/>
     <w:multiLevelType w:val="hybridMultilevel"/>
     <w:tmpl w:val="593E0130"/>
@@ -27680,7 +30252,7 @@
       </w:rPr>
     </w:lvl>
   </w:abstractNum>
-  <w:abstractNum w:abstractNumId="16" w15:restartNumberingAfterBreak="0">
+  <w:abstractNum w:abstractNumId="18" w15:restartNumberingAfterBreak="0">
     <w:nsid w:val="6C5F507D"/>
     <w:multiLevelType w:val="hybridMultilevel"/>
     <w:tmpl w:val="160AD9A2"/>
@@ -27793,7 +30365,7 @@
       </w:rPr>
     </w:lvl>
   </w:abstractNum>
-  <w:abstractNum w:abstractNumId="17" w15:restartNumberingAfterBreak="0">
+  <w:abstractNum w:abstractNumId="19" w15:restartNumberingAfterBreak="0">
     <w:nsid w:val="6EAF0A9B"/>
     <w:multiLevelType w:val="hybridMultilevel"/>
     <w:tmpl w:val="07A2334A"/>
@@ -27906,7 +30478,7 @@
       </w:rPr>
     </w:lvl>
   </w:abstractNum>
-  <w:abstractNum w:abstractNumId="18" w15:restartNumberingAfterBreak="0">
+  <w:abstractNum w:abstractNumId="20" w15:restartNumberingAfterBreak="0">
     <w:nsid w:val="7BA95155"/>
     <w:multiLevelType w:val="hybridMultilevel"/>
     <w:tmpl w:val="D566549C"/>
@@ -28019,7 +30591,7 @@
       </w:rPr>
     </w:lvl>
   </w:abstractNum>
-  <w:abstractNum w:abstractNumId="19" w15:restartNumberingAfterBreak="0">
+  <w:abstractNum w:abstractNumId="21" w15:restartNumberingAfterBreak="0">
     <w:nsid w:val="7F5D7737"/>
     <w:multiLevelType w:val="hybridMultilevel"/>
     <w:tmpl w:val="9D60DD9C"/>
@@ -28133,64 +30705,70 @@
     </w:lvl>
   </w:abstractNum>
   <w:num w:numId="1" w16cid:durableId="2098398929">
+    <w:abstractNumId w:val="5"/>
+  </w:num>
+  <w:num w:numId="2" w16cid:durableId="79252884">
+    <w:abstractNumId w:val="21"/>
+  </w:num>
+  <w:num w:numId="3" w16cid:durableId="1276981796">
+    <w:abstractNumId w:val="12"/>
+  </w:num>
+  <w:num w:numId="4" w16cid:durableId="1908493818">
+    <w:abstractNumId w:val="9"/>
+  </w:num>
+  <w:num w:numId="5" w16cid:durableId="1444303552">
+    <w:abstractNumId w:val="13"/>
+  </w:num>
+  <w:num w:numId="6" w16cid:durableId="132649646">
+    <w:abstractNumId w:val="16"/>
+  </w:num>
+  <w:num w:numId="7" w16cid:durableId="377319569">
+    <w:abstractNumId w:val="14"/>
+  </w:num>
+  <w:num w:numId="8" w16cid:durableId="8340329">
+    <w:abstractNumId w:val="17"/>
+  </w:num>
+  <w:num w:numId="9" w16cid:durableId="563681584">
+    <w:abstractNumId w:val="20"/>
+  </w:num>
+  <w:num w:numId="10" w16cid:durableId="2020110733">
+    <w:abstractNumId w:val="2"/>
+  </w:num>
+  <w:num w:numId="11" w16cid:durableId="222176246">
+    <w:abstractNumId w:val="10"/>
+  </w:num>
+  <w:num w:numId="12" w16cid:durableId="1413352452">
+    <w:abstractNumId w:val="8"/>
+  </w:num>
+  <w:num w:numId="13" w16cid:durableId="629478393">
+    <w:abstractNumId w:val="6"/>
+  </w:num>
+  <w:num w:numId="14" w16cid:durableId="52390417">
+    <w:abstractNumId w:val="18"/>
+  </w:num>
+  <w:num w:numId="15" w16cid:durableId="1159734020">
     <w:abstractNumId w:val="3"/>
   </w:num>
-  <w:num w:numId="2" w16cid:durableId="79252884">
+  <w:num w:numId="16" w16cid:durableId="851182127">
     <w:abstractNumId w:val="19"/>
-  </w:num>
-  <w:num w:numId="3" w16cid:durableId="1276981796">
-    <w:abstractNumId w:val="10"/>
-  </w:num>
-  <w:num w:numId="4" w16cid:durableId="1908493818">
-    <w:abstractNumId w:val="7"/>
-  </w:num>
-  <w:num w:numId="5" w16cid:durableId="1444303552">
-    <w:abstractNumId w:val="11"/>
-  </w:num>
-  <w:num w:numId="6" w16cid:durableId="132649646">
-    <w:abstractNumId w:val="14"/>
-  </w:num>
-  <w:num w:numId="7" w16cid:durableId="377319569">
-    <w:abstractNumId w:val="12"/>
-  </w:num>
-  <w:num w:numId="8" w16cid:durableId="8340329">
-    <w:abstractNumId w:val="15"/>
-  </w:num>
-  <w:num w:numId="9" w16cid:durableId="563681584">
-    <w:abstractNumId w:val="18"/>
-  </w:num>
-  <w:num w:numId="10" w16cid:durableId="2020110733">
-    <w:abstractNumId w:val="1"/>
-  </w:num>
-  <w:num w:numId="11" w16cid:durableId="222176246">
-    <w:abstractNumId w:val="8"/>
-  </w:num>
-  <w:num w:numId="12" w16cid:durableId="1413352452">
-    <w:abstractNumId w:val="6"/>
-  </w:num>
-  <w:num w:numId="13" w16cid:durableId="629478393">
-    <w:abstractNumId w:val="4"/>
-  </w:num>
-  <w:num w:numId="14" w16cid:durableId="52390417">
-    <w:abstractNumId w:val="16"/>
-  </w:num>
-  <w:num w:numId="15" w16cid:durableId="1159734020">
-    <w:abstractNumId w:val="2"/>
-  </w:num>
-  <w:num w:numId="16" w16cid:durableId="851182127">
-    <w:abstractNumId w:val="17"/>
   </w:num>
   <w:num w:numId="17" w16cid:durableId="704914780">
     <w:abstractNumId w:val="0"/>
   </w:num>
   <w:num w:numId="18" w16cid:durableId="25758557">
-    <w:abstractNumId w:val="5"/>
+    <w:abstractNumId w:val="7"/>
   </w:num>
   <w:num w:numId="19" w16cid:durableId="1999914960">
-    <w:abstractNumId w:val="9"/>
+    <w:abstractNumId w:val="11"/>
   </w:num>
   <w:num w:numId="20" w16cid:durableId="1069229787">
-    <w:abstractNumId w:val="13"/>
+    <w:abstractNumId w:val="15"/>
+  </w:num>
+  <w:num w:numId="21" w16cid:durableId="1754471552">
+    <w:abstractNumId w:val="4"/>
+  </w:num>
+  <w:num w:numId="22" w16cid:durableId="51848887">
+    <w:abstractNumId w:val="1"/>
   </w:num>
 </w:numbering>
 </file>

</xml_diff>